<commit_message>
please make changes to the yellow highlighted parts, and if not there is any highlight, start working on those too.
</commit_message>
<xml_diff>
--- a/Final Paper/Manuscript.docx
+++ b/Final Paper/Manuscript.docx
@@ -78,15 +78,7 @@
           <w:sz w:val="24"/>
           <w:szCs w:val="24"/>
         </w:rPr>
-        <w:t xml:space="preserve"> </w:t>
-      </w:r>
-      <w:r>
-        <w:rPr>
-          <w:rFonts w:ascii="Times New Roman" w:eastAsia="Times New Roman" w:hAnsi="Times New Roman" w:cs="Times New Roman"/>
-          <w:sz w:val="24"/>
-          <w:szCs w:val="24"/>
-        </w:rPr>
-        <w:t>Abu Bakar Siddik Mishkat</w:t>
+        <w:t xml:space="preserve"> Abu Bakar Siddik Mishkat</w:t>
       </w:r>
       <w:r>
         <w:rPr>
@@ -307,6 +299,7 @@
     <w:p>
       <w:pPr>
         <w:pStyle w:val="Heading1"/>
+        <w:spacing w:before="100" w:beforeAutospacing="1" w:after="240"/>
         <w:rPr>
           <w:rFonts w:ascii="Times New Roman" w:hAnsi="Times New Roman" w:cs="Times New Roman"/>
           <w:b/>
@@ -340,34 +333,52 @@
           <w:rFonts w:ascii="Times New Roman" w:hAnsi="Times New Roman" w:cs="Times New Roman"/>
           <w:sz w:val="24"/>
           <w:szCs w:val="24"/>
-        </w:rPr>
-        <w:t>Healthcare fraud in Medicare causes substantial losses and is hard to detect because claims data are high-dimensional and imbalanced. We present an end-to-end pipeline on a Medicare-like dataset that integrates SQL-based feature engineering, unsupervised analysis of fraud-only claims, supervised provider classification, and clustering of high-risk providers into fraud-type groups. A feature store cleans inpatient, outpatient, beneficiary, and provider tables and produces reusable claim and provider features, including aggregates, beneficiary counts, peer-normalized z-scores, and rule-based indicators for duplicate billing, upcoding, and overcharging. Using these features, we cluster fraud-only claims with HDBSCAN and characterize inpatient and outpatient patterns via principal component analysis and association rule mining. We then train supervised models; a well-regularized logistic regression achieves PR-AUC ≈0.71 and ROC-AUC ≈0.93, and its risk scores feed a second HDBSCAN step that yields distinct provider fraud-type clusters. Overall, engineered features, interpretable linear models, and unsupervised analyses provide competitive performance and actionable fraud-type characterizations.</w:t>
-      </w:r>
-    </w:p>
-    <w:p>
-      <w:pPr>
-        <w:spacing w:line="360" w:lineRule="auto"/>
-        <w:rPr>
-          <w:rFonts w:ascii="Times New Roman" w:hAnsi="Times New Roman" w:cs="Times New Roman"/>
-          <w:sz w:val="24"/>
-          <w:szCs w:val="24"/>
-        </w:rPr>
-      </w:pPr>
-      <w:r>
-        <w:rPr>
-          <w:rFonts w:ascii="Times New Roman" w:hAnsi="Times New Roman" w:cs="Times New Roman"/>
-          <w:b/>
-          <w:bCs/>
-          <w:sz w:val="24"/>
-          <w:szCs w:val="24"/>
-        </w:rPr>
-        <w:t>Keywords:</w:t>
-      </w:r>
-      <w:r>
-        <w:rPr>
-          <w:rFonts w:ascii="Times New Roman" w:hAnsi="Times New Roman" w:cs="Times New Roman"/>
-          <w:sz w:val="24"/>
-          <w:szCs w:val="24"/>
+          <w:highlight w:val="green"/>
+        </w:rPr>
+        <w:t xml:space="preserve">Healthcare fraud in Medicare always results in substantial losses of almost $100 billion annually and is getting hard to detect since the claims data are sophisticated and imbalanced. In this paper, we present a complete pipeline combining SQL feature store and supervised binary classification and unsupervised clustering on the Medicare dataset. We performed the unsupervised clustering only on the ground level fraudulent cases, </w:t>
+      </w:r>
+      <w:r>
+        <w:rPr>
+          <w:rFonts w:ascii="Times New Roman" w:hAnsi="Times New Roman" w:cs="Times New Roman"/>
+          <w:sz w:val="24"/>
+          <w:szCs w:val="24"/>
+          <w:highlight w:val="green"/>
+        </w:rPr>
+        <w:t xml:space="preserve">and then we headed over classifying the fraudulent providers and clustered the high-risk providers into the fraud type groups. We cleaned the inpatient, outpatient and beneficiary tables stored in the PostgreSQL database. We also engineered the reusable provider and claim level features for the model training and evaluation. We included rule-based indicators for duplicate claims, upcoding and overcharging along with 30/90/365 days aggregates, distinct beneficiary counts and peer-normalized z-scores. We </w:t>
+      </w:r>
+      <w:r>
+        <w:rPr>
+          <w:rFonts w:ascii="Times New Roman" w:hAnsi="Times New Roman" w:cs="Times New Roman"/>
+          <w:sz w:val="24"/>
+          <w:szCs w:val="24"/>
+          <w:highlight w:val="green"/>
+        </w:rPr>
+        <w:t>applied</w:t>
+      </w:r>
+      <w:r>
+        <w:rPr>
+          <w:rFonts w:ascii="Times New Roman" w:hAnsi="Times New Roman" w:cs="Times New Roman"/>
+          <w:sz w:val="24"/>
+          <w:szCs w:val="24"/>
+          <w:highlight w:val="green"/>
+        </w:rPr>
+        <w:t xml:space="preserve"> HDBSCAN</w:t>
+      </w:r>
+      <w:r>
+        <w:rPr>
+          <w:rFonts w:ascii="Times New Roman" w:hAnsi="Times New Roman" w:cs="Times New Roman"/>
+          <w:sz w:val="24"/>
+          <w:szCs w:val="24"/>
+          <w:highlight w:val="green"/>
+        </w:rPr>
+        <w:t xml:space="preserve"> algorithm</w:t>
+      </w:r>
+      <w:r>
+        <w:rPr>
+          <w:rFonts w:ascii="Times New Roman" w:hAnsi="Times New Roman" w:cs="Times New Roman"/>
+          <w:sz w:val="24"/>
+          <w:szCs w:val="24"/>
+          <w:highlight w:val="green"/>
         </w:rPr>
         <w:t xml:space="preserve"> </w:t>
       </w:r>
@@ -376,46 +387,79 @@
           <w:rFonts w:ascii="Times New Roman" w:hAnsi="Times New Roman" w:cs="Times New Roman"/>
           <w:sz w:val="24"/>
           <w:szCs w:val="24"/>
-        </w:rPr>
-        <w:t>Medi</w:t>
-      </w:r>
-      <w:r>
-        <w:rPr>
-          <w:rFonts w:ascii="Times New Roman" w:hAnsi="Times New Roman" w:cs="Times New Roman"/>
-          <w:sz w:val="24"/>
-          <w:szCs w:val="24"/>
-        </w:rPr>
-        <w:t>care</w:t>
-      </w:r>
-      <w:r>
-        <w:rPr>
-          <w:rFonts w:ascii="Times New Roman" w:hAnsi="Times New Roman" w:cs="Times New Roman"/>
-          <w:sz w:val="24"/>
-          <w:szCs w:val="24"/>
-        </w:rPr>
-        <w:t xml:space="preserve"> Fraud Detection</w:t>
-      </w:r>
-      <w:r>
-        <w:rPr>
-          <w:rFonts w:ascii="Times New Roman" w:hAnsi="Times New Roman" w:cs="Times New Roman"/>
-          <w:sz w:val="24"/>
-          <w:szCs w:val="24"/>
-        </w:rPr>
-        <w:t>,</w:t>
-      </w:r>
-      <w:r>
-        <w:rPr>
-          <w:rFonts w:ascii="Times New Roman" w:hAnsi="Times New Roman" w:cs="Times New Roman"/>
-          <w:sz w:val="24"/>
-          <w:szCs w:val="24"/>
-        </w:rPr>
-        <w:t xml:space="preserve"> Insurance Fraud Types</w:t>
-      </w:r>
-      <w:r>
-        <w:rPr>
-          <w:rFonts w:ascii="Times New Roman" w:hAnsi="Times New Roman" w:cs="Times New Roman"/>
-          <w:sz w:val="24"/>
-          <w:szCs w:val="24"/>
+          <w:highlight w:val="green"/>
+        </w:rPr>
+        <w:t>for spotting</w:t>
+      </w:r>
+      <w:r>
+        <w:rPr>
+          <w:rFonts w:ascii="Times New Roman" w:hAnsi="Times New Roman" w:cs="Times New Roman"/>
+          <w:sz w:val="24"/>
+          <w:szCs w:val="24"/>
+          <w:highlight w:val="green"/>
+        </w:rPr>
+        <w:t xml:space="preserve"> patterns </w:t>
+      </w:r>
+      <w:r>
+        <w:rPr>
+          <w:rFonts w:ascii="Times New Roman" w:hAnsi="Times New Roman" w:cs="Times New Roman"/>
+          <w:sz w:val="24"/>
+          <w:szCs w:val="24"/>
+          <w:highlight w:val="green"/>
+        </w:rPr>
+        <w:t xml:space="preserve">in </w:t>
+      </w:r>
+      <w:r>
+        <w:rPr>
+          <w:rFonts w:ascii="Times New Roman" w:hAnsi="Times New Roman" w:cs="Times New Roman"/>
+          <w:sz w:val="24"/>
+          <w:szCs w:val="24"/>
+          <w:highlight w:val="green"/>
+        </w:rPr>
+        <w:t>inpatient and outpatient claims</w:t>
+      </w:r>
+      <w:r>
+        <w:rPr>
+          <w:rFonts w:ascii="Times New Roman" w:hAnsi="Times New Roman" w:cs="Times New Roman"/>
+          <w:sz w:val="24"/>
+          <w:szCs w:val="24"/>
+          <w:highlight w:val="green"/>
+        </w:rPr>
+        <w:t xml:space="preserve">. </w:t>
+      </w:r>
+      <w:r>
+        <w:rPr>
+          <w:rFonts w:ascii="Times New Roman" w:hAnsi="Times New Roman" w:cs="Times New Roman"/>
+          <w:sz w:val="24"/>
+          <w:szCs w:val="24"/>
+          <w:highlight w:val="green"/>
+        </w:rPr>
+        <w:t>For visualization, w</w:t>
+      </w:r>
+      <w:r>
+        <w:rPr>
+          <w:rFonts w:ascii="Times New Roman" w:hAnsi="Times New Roman" w:cs="Times New Roman"/>
+          <w:sz w:val="24"/>
+          <w:szCs w:val="24"/>
+          <w:highlight w:val="green"/>
+        </w:rPr>
+        <w:t xml:space="preserve">e </w:t>
+      </w:r>
+      <w:r>
+        <w:rPr>
+          <w:rFonts w:ascii="Times New Roman" w:hAnsi="Times New Roman" w:cs="Times New Roman"/>
+          <w:sz w:val="24"/>
+          <w:szCs w:val="24"/>
+          <w:highlight w:val="green"/>
+        </w:rPr>
+        <w:t>used PCA</w:t>
+      </w:r>
+      <w:r>
+        <w:rPr>
+          <w:rFonts w:ascii="Times New Roman" w:hAnsi="Times New Roman" w:cs="Times New Roman"/>
+          <w:sz w:val="24"/>
+          <w:szCs w:val="24"/>
+          <w:highlight w:val="green"/>
         </w:rPr>
         <w:t xml:space="preserve"> </w:t>
       </w:r>
@@ -424,92 +468,243 @@
           <w:rFonts w:ascii="Times New Roman" w:hAnsi="Times New Roman" w:cs="Times New Roman"/>
           <w:sz w:val="24"/>
           <w:szCs w:val="24"/>
-        </w:rPr>
-        <w:t xml:space="preserve">, </w:t>
-      </w:r>
-      <w:r>
-        <w:rPr>
-          <w:rFonts w:ascii="Times New Roman" w:hAnsi="Times New Roman" w:cs="Times New Roman"/>
-          <w:sz w:val="24"/>
-          <w:szCs w:val="24"/>
-        </w:rPr>
-        <w:t>Tree-based ensemble learning</w:t>
-      </w:r>
-      <w:r>
-        <w:rPr>
-          <w:rFonts w:ascii="Times New Roman" w:hAnsi="Times New Roman" w:cs="Times New Roman"/>
-          <w:sz w:val="24"/>
-          <w:szCs w:val="24"/>
-        </w:rPr>
-        <w:t>, Insurance Claims</w:t>
-      </w:r>
-      <w:r>
-        <w:rPr>
-          <w:rFonts w:ascii="Times New Roman" w:hAnsi="Times New Roman" w:cs="Times New Roman"/>
-          <w:sz w:val="24"/>
-          <w:szCs w:val="24"/>
-        </w:rPr>
-        <w:t>, HDBSCAN Fraud Clustering</w:t>
-      </w:r>
-      <w:r>
-        <w:rPr>
-          <w:rFonts w:ascii="Times New Roman" w:hAnsi="Times New Roman" w:cs="Times New Roman"/>
-          <w:sz w:val="24"/>
-          <w:szCs w:val="24"/>
+          <w:highlight w:val="green"/>
+        </w:rPr>
+        <w:t xml:space="preserve">to map out the data structure </w:t>
+      </w:r>
+      <w:r>
+        <w:rPr>
+          <w:rFonts w:ascii="Times New Roman" w:hAnsi="Times New Roman" w:cs="Times New Roman"/>
+          <w:sz w:val="24"/>
+          <w:szCs w:val="24"/>
+          <w:highlight w:val="green"/>
+        </w:rPr>
+        <w:t>and association rule mining</w:t>
+      </w:r>
+      <w:r>
+        <w:rPr>
+          <w:rFonts w:ascii="Times New Roman" w:hAnsi="Times New Roman" w:cs="Times New Roman"/>
+          <w:sz w:val="24"/>
+          <w:szCs w:val="24"/>
+          <w:highlight w:val="green"/>
+        </w:rPr>
+        <w:t xml:space="preserve"> to label the clusters</w:t>
+      </w:r>
+      <w:r>
+        <w:rPr>
+          <w:rFonts w:ascii="Times New Roman" w:hAnsi="Times New Roman" w:cs="Times New Roman"/>
+          <w:sz w:val="24"/>
+          <w:szCs w:val="24"/>
+          <w:highlight w:val="green"/>
+        </w:rPr>
+        <w:t xml:space="preserve">. We </w:t>
+      </w:r>
+      <w:r>
+        <w:rPr>
+          <w:rFonts w:ascii="Times New Roman" w:hAnsi="Times New Roman" w:cs="Times New Roman"/>
+          <w:sz w:val="24"/>
+          <w:szCs w:val="24"/>
+          <w:highlight w:val="green"/>
+        </w:rPr>
+        <w:t>went through</w:t>
+      </w:r>
+      <w:r>
+        <w:rPr>
+          <w:rFonts w:ascii="Times New Roman" w:hAnsi="Times New Roman" w:cs="Times New Roman"/>
+          <w:sz w:val="24"/>
+          <w:szCs w:val="24"/>
+          <w:highlight w:val="green"/>
+        </w:rPr>
+        <w:t xml:space="preserve"> a</w:t>
+      </w:r>
+      <w:r>
+        <w:rPr>
+          <w:rFonts w:ascii="Times New Roman" w:hAnsi="Times New Roman" w:cs="Times New Roman"/>
+          <w:sz w:val="24"/>
+          <w:szCs w:val="24"/>
+          <w:highlight w:val="green"/>
+        </w:rPr>
+        <w:t xml:space="preserve"> bunch</w:t>
+      </w:r>
+      <w:r>
+        <w:rPr>
+          <w:rFonts w:ascii="Times New Roman" w:hAnsi="Times New Roman" w:cs="Times New Roman"/>
+          <w:sz w:val="24"/>
+          <w:szCs w:val="24"/>
+          <w:highlight w:val="green"/>
+        </w:rPr>
+        <w:t xml:space="preserve"> of supervised models and logistic regression </w:t>
+      </w:r>
+      <w:r>
+        <w:rPr>
+          <w:rFonts w:ascii="Times New Roman" w:hAnsi="Times New Roman" w:cs="Times New Roman"/>
+          <w:sz w:val="24"/>
+          <w:szCs w:val="24"/>
+          <w:highlight w:val="green"/>
+        </w:rPr>
+        <w:t>ended up with</w:t>
+      </w:r>
+      <w:r>
+        <w:rPr>
+          <w:rFonts w:ascii="Times New Roman" w:hAnsi="Times New Roman" w:cs="Times New Roman"/>
+          <w:sz w:val="24"/>
+          <w:szCs w:val="24"/>
+          <w:highlight w:val="green"/>
+        </w:rPr>
+        <w:t xml:space="preserve"> PR-AUC </w:t>
+      </w:r>
+      <w:r>
+        <w:rPr>
+          <w:rFonts w:ascii="Times New Roman" w:hAnsi="Times New Roman" w:cs="Times New Roman"/>
+          <w:sz w:val="24"/>
+          <w:szCs w:val="24"/>
+          <w:highlight w:val="green"/>
+        </w:rPr>
+        <w:t xml:space="preserve">around </w:t>
+      </w:r>
+      <w:r>
+        <w:rPr>
+          <w:rFonts w:ascii="Times New Roman" w:hAnsi="Times New Roman" w:cs="Times New Roman"/>
+          <w:sz w:val="24"/>
+          <w:szCs w:val="24"/>
+          <w:highlight w:val="green"/>
+        </w:rPr>
+        <w:t xml:space="preserve">0.73 and ROC-AUC </w:t>
+      </w:r>
+      <w:r>
+        <w:rPr>
+          <w:rFonts w:ascii="Times New Roman" w:hAnsi="Times New Roman" w:cs="Times New Roman"/>
+          <w:sz w:val="24"/>
+          <w:szCs w:val="24"/>
+          <w:highlight w:val="green"/>
+        </w:rPr>
+        <w:t xml:space="preserve">around </w:t>
+      </w:r>
+      <w:r>
+        <w:rPr>
+          <w:rFonts w:ascii="Times New Roman" w:hAnsi="Times New Roman" w:cs="Times New Roman"/>
+          <w:sz w:val="24"/>
+          <w:szCs w:val="24"/>
+          <w:highlight w:val="green"/>
+        </w:rPr>
+        <w:t>0.9</w:t>
+      </w:r>
+      <w:r>
+        <w:rPr>
+          <w:rFonts w:ascii="Times New Roman" w:hAnsi="Times New Roman" w:cs="Times New Roman"/>
+          <w:sz w:val="24"/>
+          <w:szCs w:val="24"/>
+          <w:highlight w:val="green"/>
+        </w:rPr>
+        <w:t>4</w:t>
+      </w:r>
+      <w:r>
+        <w:rPr>
+          <w:rFonts w:ascii="Times New Roman" w:hAnsi="Times New Roman" w:cs="Times New Roman"/>
+          <w:sz w:val="24"/>
+          <w:szCs w:val="24"/>
+          <w:highlight w:val="green"/>
+        </w:rPr>
+        <w:t>. Overall, computed features</w:t>
+      </w:r>
+      <w:r>
+        <w:rPr>
+          <w:rFonts w:ascii="Times New Roman" w:hAnsi="Times New Roman" w:cs="Times New Roman"/>
+          <w:sz w:val="24"/>
+          <w:szCs w:val="24"/>
+          <w:highlight w:val="green"/>
+        </w:rPr>
+        <w:t xml:space="preserve"> along with</w:t>
+      </w:r>
+      <w:r>
+        <w:rPr>
+          <w:rFonts w:ascii="Times New Roman" w:hAnsi="Times New Roman" w:cs="Times New Roman"/>
+          <w:sz w:val="24"/>
+          <w:szCs w:val="24"/>
+          <w:highlight w:val="green"/>
         </w:rPr>
         <w:t xml:space="preserve"> </w:t>
       </w:r>
-    </w:p>
-    <w:p>
-      <w:pPr>
-        <w:pStyle w:val="Heading1"/>
-        <w:spacing w:after="240"/>
-        <w:rPr>
-          <w:rFonts w:ascii="Times New Roman" w:hAnsi="Times New Roman" w:cs="Times New Roman"/>
-          <w:b/>
-          <w:bCs/>
-          <w:sz w:val="28"/>
-          <w:szCs w:val="28"/>
-        </w:rPr>
-      </w:pPr>
-      <w:r>
-        <w:rPr>
-          <w:rFonts w:ascii="Times New Roman" w:hAnsi="Times New Roman" w:cs="Times New Roman"/>
-          <w:b/>
-          <w:bCs/>
-          <w:sz w:val="28"/>
-          <w:szCs w:val="28"/>
-        </w:rPr>
-        <w:lastRenderedPageBreak/>
-        <w:t>2. Introduction</w:t>
-      </w:r>
-    </w:p>
-    <w:p>
-      <w:pPr>
-        <w:spacing w:line="360" w:lineRule="auto"/>
-        <w:rPr>
-          <w:rFonts w:ascii="Times New Roman" w:hAnsi="Times New Roman" w:cs="Times New Roman"/>
-          <w:b/>
-          <w:bCs/>
-          <w:i/>
-          <w:iCs/>
-          <w:sz w:val="24"/>
-          <w:szCs w:val="24"/>
-          <w:lang w:val="en-US"/>
-        </w:rPr>
-      </w:pPr>
-      <w:r>
-        <w:rPr>
-          <w:rFonts w:ascii="Times New Roman" w:hAnsi="Times New Roman" w:cs="Times New Roman"/>
-          <w:b/>
-          <w:bCs/>
-          <w:i/>
-          <w:iCs/>
-          <w:sz w:val="24"/>
-          <w:szCs w:val="24"/>
-          <w:lang w:val="en-US"/>
-        </w:rPr>
-        <w:t>2.1 Background and motivation</w:t>
+      <w:r>
+        <w:rPr>
+          <w:rFonts w:ascii="Times New Roman" w:hAnsi="Times New Roman" w:cs="Times New Roman"/>
+          <w:sz w:val="24"/>
+          <w:szCs w:val="24"/>
+          <w:highlight w:val="green"/>
+        </w:rPr>
+        <w:t xml:space="preserve">the </w:t>
+      </w:r>
+      <w:r>
+        <w:rPr>
+          <w:rFonts w:ascii="Times New Roman" w:hAnsi="Times New Roman" w:cs="Times New Roman"/>
+          <w:sz w:val="24"/>
+          <w:szCs w:val="24"/>
+          <w:highlight w:val="green"/>
+        </w:rPr>
+        <w:t xml:space="preserve">supervised models and unsupervised clustering </w:t>
+      </w:r>
+      <w:r>
+        <w:rPr>
+          <w:rFonts w:ascii="Times New Roman" w:hAnsi="Times New Roman" w:cs="Times New Roman"/>
+          <w:sz w:val="24"/>
+          <w:szCs w:val="24"/>
+          <w:highlight w:val="green"/>
+        </w:rPr>
+        <w:t>gave us a strong</w:t>
+      </w:r>
+      <w:r>
+        <w:rPr>
+          <w:rFonts w:ascii="Times New Roman" w:hAnsi="Times New Roman" w:cs="Times New Roman"/>
+          <w:sz w:val="24"/>
+          <w:szCs w:val="24"/>
+          <w:highlight w:val="green"/>
+        </w:rPr>
+        <w:t xml:space="preserve"> benchmark</w:t>
+      </w:r>
+      <w:r>
+        <w:rPr>
+          <w:rFonts w:ascii="Times New Roman" w:hAnsi="Times New Roman" w:cs="Times New Roman"/>
+          <w:sz w:val="24"/>
+          <w:szCs w:val="24"/>
+          <w:highlight w:val="green"/>
+        </w:rPr>
+        <w:t xml:space="preserve"> for</w:t>
+      </w:r>
+      <w:r>
+        <w:rPr>
+          <w:rFonts w:ascii="Times New Roman" w:hAnsi="Times New Roman" w:cs="Times New Roman"/>
+          <w:sz w:val="24"/>
+          <w:szCs w:val="24"/>
+          <w:highlight w:val="green"/>
+        </w:rPr>
+        <w:t xml:space="preserve"> evaluation</w:t>
+      </w:r>
+      <w:r>
+        <w:rPr>
+          <w:rFonts w:ascii="Times New Roman" w:hAnsi="Times New Roman" w:cs="Times New Roman"/>
+          <w:sz w:val="24"/>
+          <w:szCs w:val="24"/>
+          <w:highlight w:val="green"/>
+        </w:rPr>
+        <w:t xml:space="preserve">. These also helped characterize different </w:t>
+      </w:r>
+      <w:r>
+        <w:rPr>
+          <w:rFonts w:ascii="Times New Roman" w:hAnsi="Times New Roman" w:cs="Times New Roman"/>
+          <w:sz w:val="24"/>
+          <w:szCs w:val="24"/>
+          <w:highlight w:val="green"/>
+        </w:rPr>
+        <w:t>fraud</w:t>
+      </w:r>
+      <w:r>
+        <w:rPr>
+          <w:rFonts w:ascii="Times New Roman" w:hAnsi="Times New Roman" w:cs="Times New Roman"/>
+          <w:sz w:val="24"/>
+          <w:szCs w:val="24"/>
+          <w:highlight w:val="green"/>
+        </w:rPr>
+        <w:t xml:space="preserve"> types effectively.</w:t>
       </w:r>
     </w:p>
     <w:p>
@@ -519,120 +714,114 @@
           <w:rFonts w:ascii="Times New Roman" w:hAnsi="Times New Roman" w:cs="Times New Roman"/>
           <w:sz w:val="24"/>
           <w:szCs w:val="24"/>
-          <w:lang w:val="en-US"/>
         </w:rPr>
       </w:pPr>
       <w:r>
-        <w:rPr>
-          <w:rFonts w:ascii="Times New Roman" w:hAnsi="Times New Roman" w:cs="Times New Roman"/>
-          <w:sz w:val="24"/>
-          <w:szCs w:val="24"/>
-        </w:rPr>
-        <w:t>Healthcare fraud, waste, and abuse in large public insurance programs such as Medicare cause substantial economic losses—estimated at tens to hundreds of billions of dollars annually—and divert resources away from patient care while eroding trust in the health system [12], [14]. Modern claims databases covering millions of encounters across beneficiaries, providers, diagnoses, and procedures offer opportunities for more systematic detection but are high-dimensional, heterogeneous, and severely imbalanced, with fraudulent cases forming a tiny minority of all claims [3], [8], [12]. In such settings, purely rule-based systems are transparent and easy to deploy but often struggle to keep pace with evolving schemes and can generate high false-positive rates. These limitations have motivated extensive research into machine learning and data mining methods for healthcare fraud detection, spanning supervised classification, unsupervised anomaly detection, and hybrid approaches that combine rules, statistical models, and more advanced architectures [3], [5], [8], [12], [14], [15].</w:t>
-      </w:r>
-    </w:p>
-    <w:p>
-      <w:pPr>
-        <w:spacing w:line="360" w:lineRule="auto"/>
         <w:rPr>
           <w:rFonts w:ascii="Times New Roman" w:hAnsi="Times New Roman" w:cs="Times New Roman"/>
           <w:b/>
           <w:bCs/>
-          <w:i/>
-          <w:iCs/>
-          <w:sz w:val="24"/>
-          <w:szCs w:val="24"/>
-          <w:lang w:val="en-US"/>
-        </w:rPr>
-      </w:pPr>
-      <w:r>
-        <w:rPr>
-          <w:rFonts w:ascii="Times New Roman" w:hAnsi="Times New Roman" w:cs="Times New Roman"/>
-          <w:b/>
-          <w:bCs/>
-          <w:i/>
-          <w:iCs/>
-          <w:sz w:val="24"/>
-          <w:szCs w:val="24"/>
-          <w:lang w:val="en-US"/>
-        </w:rPr>
-        <w:t>2.</w:t>
-      </w:r>
-      <w:r>
-        <w:rPr>
-          <w:rFonts w:ascii="Times New Roman" w:hAnsi="Times New Roman" w:cs="Times New Roman"/>
-          <w:b/>
-          <w:bCs/>
-          <w:i/>
-          <w:iCs/>
-          <w:sz w:val="24"/>
-          <w:szCs w:val="24"/>
-          <w:lang w:val="en-US"/>
-        </w:rPr>
-        <w:t>2</w:t>
-      </w:r>
-      <w:r>
-        <w:rPr>
-          <w:rFonts w:ascii="Times New Roman" w:hAnsi="Times New Roman" w:cs="Times New Roman"/>
-          <w:b/>
-          <w:bCs/>
-          <w:i/>
-          <w:iCs/>
-          <w:sz w:val="24"/>
-          <w:szCs w:val="24"/>
-          <w:lang w:val="en-US"/>
+          <w:sz w:val="24"/>
+          <w:szCs w:val="24"/>
+        </w:rPr>
+        <w:lastRenderedPageBreak/>
+        <w:t>Keywords:</w:t>
+      </w:r>
+      <w:r>
+        <w:rPr>
+          <w:rFonts w:ascii="Times New Roman" w:hAnsi="Times New Roman" w:cs="Times New Roman"/>
+          <w:sz w:val="24"/>
+          <w:szCs w:val="24"/>
         </w:rPr>
         <w:t xml:space="preserve"> </w:t>
       </w:r>
       <w:r>
         <w:rPr>
           <w:rFonts w:ascii="Times New Roman" w:hAnsi="Times New Roman" w:cs="Times New Roman"/>
-          <w:b/>
-          <w:bCs/>
-          <w:i/>
-          <w:iCs/>
-          <w:sz w:val="24"/>
-          <w:szCs w:val="24"/>
-          <w:lang w:val="en-US"/>
-        </w:rPr>
-        <w:t>Related Work</w:t>
-      </w:r>
-    </w:p>
-    <w:p>
-      <w:pPr>
-        <w:spacing w:after="100" w:afterAutospacing="1" w:line="360" w:lineRule="auto"/>
-        <w:rPr>
-          <w:rFonts w:ascii="Times New Roman" w:hAnsi="Times New Roman" w:cs="Times New Roman"/>
-          <w:sz w:val="24"/>
-          <w:szCs w:val="24"/>
-          <w:lang w:val="en-US"/>
-        </w:rPr>
-      </w:pPr>
-      <w:r>
-        <w:rPr>
-          <w:rFonts w:ascii="Times New Roman" w:hAnsi="Times New Roman" w:cs="Times New Roman"/>
-          <w:sz w:val="24"/>
-          <w:szCs w:val="24"/>
-        </w:rPr>
-        <w:t xml:space="preserve">Recent surveys synthesize machine learning techniques for health insurance and Medicare fraud detection, including classical statistical models, tree ensembles, support vector machines, deep learning, and hybrid pipelines [3], [8], [12], [14]. Supervised models such as logistic regression, decision trees, random forests, and gradient boosting are trained on labelled provider- or claim-level data and perform well when labels exist, but their effectiveness is constrained by label scarcity and fraud patterns [3], [5], [7], [8], [11]. Unsupervised methods—clustering and outlier detection algorithms such as k-means, density-based approaches, and anomaly models—highlight atypical claims or providers when labels are </w:t>
-      </w:r>
-      <w:proofErr w:type="gramStart"/>
-      <w:r>
-        <w:rPr>
-          <w:rFonts w:ascii="Times New Roman" w:hAnsi="Times New Roman" w:cs="Times New Roman"/>
-          <w:sz w:val="24"/>
-          <w:szCs w:val="24"/>
-        </w:rPr>
-        <w:t>limited, yet</w:t>
-      </w:r>
-      <w:proofErr w:type="gramEnd"/>
-      <w:r>
-        <w:rPr>
-          <w:rFonts w:ascii="Times New Roman" w:hAnsi="Times New Roman" w:cs="Times New Roman"/>
-          <w:sz w:val="24"/>
-          <w:szCs w:val="24"/>
-        </w:rPr>
-        <w:t xml:space="preserve"> depend heavily on feature construction and can yield false positives if used alone [1], [2], [6], [13], [15]. Association rule mining discovers frequent, high-cost, or unusual diagnosis–procedure combinations that may indicate fraud schemes [5], [10]. Recent overviews emphasize combining rules, supervised models, and unsupervised detectors within end-to-end pipelines [3], [8], [12], [14], [15].</w:t>
+          <w:sz w:val="24"/>
+          <w:szCs w:val="24"/>
+        </w:rPr>
+        <w:t>Medi</w:t>
+      </w:r>
+      <w:r>
+        <w:rPr>
+          <w:rFonts w:ascii="Times New Roman" w:hAnsi="Times New Roman" w:cs="Times New Roman"/>
+          <w:sz w:val="24"/>
+          <w:szCs w:val="24"/>
+        </w:rPr>
+        <w:t>care</w:t>
+      </w:r>
+      <w:r>
+        <w:rPr>
+          <w:rFonts w:ascii="Times New Roman" w:hAnsi="Times New Roman" w:cs="Times New Roman"/>
+          <w:sz w:val="24"/>
+          <w:szCs w:val="24"/>
+        </w:rPr>
+        <w:t xml:space="preserve"> Fraud Detection</w:t>
+      </w:r>
+      <w:r>
+        <w:rPr>
+          <w:rFonts w:ascii="Times New Roman" w:hAnsi="Times New Roman" w:cs="Times New Roman"/>
+          <w:sz w:val="24"/>
+          <w:szCs w:val="24"/>
+        </w:rPr>
+        <w:t>,</w:t>
+      </w:r>
+      <w:r>
+        <w:rPr>
+          <w:rFonts w:ascii="Times New Roman" w:hAnsi="Times New Roman" w:cs="Times New Roman"/>
+          <w:sz w:val="24"/>
+          <w:szCs w:val="24"/>
+        </w:rPr>
+        <w:t xml:space="preserve"> Insurance Fraud Types</w:t>
+      </w:r>
+      <w:r>
+        <w:rPr>
+          <w:rFonts w:ascii="Times New Roman" w:hAnsi="Times New Roman" w:cs="Times New Roman"/>
+          <w:sz w:val="24"/>
+          <w:szCs w:val="24"/>
+        </w:rPr>
+        <w:t xml:space="preserve"> </w:t>
+      </w:r>
+      <w:r>
+        <w:rPr>
+          <w:rFonts w:ascii="Times New Roman" w:hAnsi="Times New Roman" w:cs="Times New Roman"/>
+          <w:sz w:val="24"/>
+          <w:szCs w:val="24"/>
+        </w:rPr>
+        <w:t xml:space="preserve">, </w:t>
+      </w:r>
+      <w:r>
+        <w:rPr>
+          <w:rFonts w:ascii="Times New Roman" w:hAnsi="Times New Roman" w:cs="Times New Roman"/>
+          <w:sz w:val="24"/>
+          <w:szCs w:val="24"/>
+        </w:rPr>
+        <w:t>Tree-based ensemble learning</w:t>
+      </w:r>
+      <w:r>
+        <w:rPr>
+          <w:rFonts w:ascii="Times New Roman" w:hAnsi="Times New Roman" w:cs="Times New Roman"/>
+          <w:sz w:val="24"/>
+          <w:szCs w:val="24"/>
+        </w:rPr>
+        <w:t>, Insurance Claims</w:t>
+      </w:r>
+      <w:r>
+        <w:rPr>
+          <w:rFonts w:ascii="Times New Roman" w:hAnsi="Times New Roman" w:cs="Times New Roman"/>
+          <w:sz w:val="24"/>
+          <w:szCs w:val="24"/>
+        </w:rPr>
+        <w:t>, HDBSCAN Fraud Clustering</w:t>
+      </w:r>
+      <w:r>
+        <w:rPr>
+          <w:rFonts w:ascii="Times New Roman" w:hAnsi="Times New Roman" w:cs="Times New Roman"/>
+          <w:sz w:val="24"/>
+          <w:szCs w:val="24"/>
+        </w:rPr>
+        <w:t>.</w:t>
       </w:r>
     </w:p>
     <w:p>
@@ -655,7 +844,7 @@
           <w:sz w:val="28"/>
           <w:szCs w:val="28"/>
         </w:rPr>
-        <w:t>3. Methodology</w:t>
+        <w:t>2. Introduction</w:t>
       </w:r>
     </w:p>
     <w:p>
@@ -669,6 +858,7 @@
           <w:iCs/>
           <w:sz w:val="24"/>
           <w:szCs w:val="24"/>
+          <w:lang w:val="en-US"/>
         </w:rPr>
       </w:pPr>
       <w:r>
@@ -680,17 +870,19 @@
           <w:iCs/>
           <w:sz w:val="24"/>
           <w:szCs w:val="24"/>
-        </w:rPr>
-        <w:t>3.1. Data sources and study design</w:t>
+          <w:lang w:val="en-US"/>
+        </w:rPr>
+        <w:t>2.1 Background and motivation</w:t>
       </w:r>
     </w:p>
     <w:p>
       <w:pPr>
-        <w:spacing w:after="240" w:line="360" w:lineRule="auto"/>
-        <w:rPr>
-          <w:rFonts w:ascii="Times New Roman" w:hAnsi="Times New Roman" w:cs="Times New Roman"/>
-          <w:sz w:val="24"/>
-          <w:szCs w:val="24"/>
+        <w:spacing w:after="100" w:afterAutospacing="1" w:line="360" w:lineRule="auto"/>
+        <w:rPr>
+          <w:rFonts w:ascii="Times New Roman" w:hAnsi="Times New Roman" w:cs="Times New Roman"/>
+          <w:sz w:val="24"/>
+          <w:szCs w:val="24"/>
+          <w:lang w:val="en-US"/>
         </w:rPr>
       </w:pPr>
       <w:r>
@@ -698,9 +890,36 @@
           <w:rFonts w:ascii="Times New Roman" w:hAnsi="Times New Roman" w:cs="Times New Roman"/>
           <w:sz w:val="24"/>
           <w:szCs w:val="24"/>
-        </w:rPr>
-        <w:lastRenderedPageBreak/>
-        <w:t>We used the “Healthcare Provider Fraud Detection Analysis” dataset from Medical Sphere, a Medicare dataset with training and test partitions. Each partition has four tables: provider, inpatient claims, outpatient claims, and beneficiary. The training provider table includes a PotentialFraud flag, recoded as a binary label (label_provider_fraud_1_0) indicating suspected fraud. Inpatient and outpatient tables contain one row per claim with claim, beneficiary, and provider IDs, dates, reimbursed amount, deductibles, and diagnosis/procedure codes; the inpatient table also has admission and discharge dates and diagnosis-group fields. The beneficiary table provides demographics, coverage, and chronic condition indicators. Providers are the primary unit: we classify them as fraudulent using aggregated history, while claims are used for feature construction and unsupervised clustering on fraud-only claims. For supervised learning we use training providers with a stratified 70/30 provider-level split, then apply the classifier to unlabeled test providers to generate risk scores and labels for clustering providers.</w:t>
+          <w:highlight w:val="green"/>
+        </w:rPr>
+        <w:t xml:space="preserve">Healthcare fraud and abuse in large public insurance programs such as Medicare results in significant financial losses. This waste also eroded the trust in health systems [12], [14]. Medicare claims provide a lot of information regarding the patients, providers, diagnoses, procedures, deductibles, reimbursements for detection. However, those features are highly imbalanced and multidimensional. The fraudulent detection is sophisticated since </w:t>
+      </w:r>
+      <w:r>
+        <w:rPr>
+          <w:rFonts w:ascii="Times New Roman" w:hAnsi="Times New Roman" w:cs="Times New Roman"/>
+          <w:sz w:val="24"/>
+          <w:szCs w:val="24"/>
+          <w:highlight w:val="green"/>
+        </w:rPr>
+        <w:t xml:space="preserve">fraud cases are rare among all the claims [3], [8], [12]. In such cases, rule-based systems are easy to deploy but are not great to automate the fraud detection and can generate high false-positive claims. These limitations have inspired </w:t>
+      </w:r>
+      <w:r>
+        <w:rPr>
+          <w:rFonts w:ascii="Times New Roman" w:hAnsi="Times New Roman" w:cs="Times New Roman"/>
+          <w:sz w:val="24"/>
+          <w:szCs w:val="24"/>
+          <w:highlight w:val="green"/>
+        </w:rPr>
+        <w:t>comprehensive</w:t>
+      </w:r>
+      <w:r>
+        <w:rPr>
+          <w:rFonts w:ascii="Times New Roman" w:hAnsi="Times New Roman" w:cs="Times New Roman"/>
+          <w:sz w:val="24"/>
+          <w:szCs w:val="24"/>
+          <w:highlight w:val="green"/>
+        </w:rPr>
+        <w:t xml:space="preserve"> research into SQL-based feature engineering, machine learning and data mining approaches in healthcare fraud detection to invent hybrid approaches [3], [5], [8], [12], [14], [15].</w:t>
       </w:r>
     </w:p>
     <w:p>
@@ -714,6 +933,7 @@
           <w:iCs/>
           <w:sz w:val="24"/>
           <w:szCs w:val="24"/>
+          <w:lang w:val="en-US"/>
         </w:rPr>
       </w:pPr>
       <w:r>
@@ -725,8 +945,48 @@
           <w:iCs/>
           <w:sz w:val="24"/>
           <w:szCs w:val="24"/>
-        </w:rPr>
-        <w:t>3.2 Data cleaning and SQL feature store</w:t>
+          <w:lang w:val="en-US"/>
+        </w:rPr>
+        <w:t>2.</w:t>
+      </w:r>
+      <w:r>
+        <w:rPr>
+          <w:rFonts w:ascii="Times New Roman" w:hAnsi="Times New Roman" w:cs="Times New Roman"/>
+          <w:b/>
+          <w:bCs/>
+          <w:i/>
+          <w:iCs/>
+          <w:sz w:val="24"/>
+          <w:szCs w:val="24"/>
+          <w:lang w:val="en-US"/>
+        </w:rPr>
+        <w:t>2</w:t>
+      </w:r>
+      <w:r>
+        <w:rPr>
+          <w:rFonts w:ascii="Times New Roman" w:hAnsi="Times New Roman" w:cs="Times New Roman"/>
+          <w:b/>
+          <w:bCs/>
+          <w:i/>
+          <w:iCs/>
+          <w:sz w:val="24"/>
+          <w:szCs w:val="24"/>
+          <w:lang w:val="en-US"/>
+        </w:rPr>
+        <w:t xml:space="preserve"> </w:t>
+      </w:r>
+      <w:r>
+        <w:rPr>
+          <w:rFonts w:ascii="Times New Roman" w:hAnsi="Times New Roman" w:cs="Times New Roman"/>
+          <w:b/>
+          <w:bCs/>
+          <w:i/>
+          <w:iCs/>
+          <w:sz w:val="24"/>
+          <w:szCs w:val="24"/>
+          <w:lang w:val="en-US"/>
+        </w:rPr>
+        <w:t>Related Work</w:t>
       </w:r>
     </w:p>
     <w:p>
@@ -736,6 +996,7 @@
           <w:rFonts w:ascii="Times New Roman" w:hAnsi="Times New Roman" w:cs="Times New Roman"/>
           <w:sz w:val="24"/>
           <w:szCs w:val="24"/>
+          <w:lang w:val="en-US"/>
         </w:rPr>
       </w:pPr>
       <w:r>
@@ -743,255 +1004,486 @@
           <w:rFonts w:ascii="Times New Roman" w:hAnsi="Times New Roman" w:cs="Times New Roman"/>
           <w:sz w:val="24"/>
           <w:szCs w:val="24"/>
-        </w:rPr>
-        <w:t>All data processing was implemented in PostgreSQL using a layered design. Raw CSVs were first loaded into a staging schema with all fields as text and basic checks on structure and column counts. Cleaned data moved to a curated schema, where placeholder strings for missing values were converted to NULL and columns cast to appropriate types (DATE for dates, numeric for amounts and counts, integer/boolean for categorical indicators). In this layer we enforced key integrity constraints: unique provider and beneficiary IDs, non-null and unique claim IDs in inpatient and outpatient tables, valid foreign keys, and admission–discharge pairs yielding plausible, non-negative lengths of stay. Reimbursement amounts were checked for negative or extreme values and distributions inspected for errors. On top of the curated layer, we built a mart schema as a feature store with a consolidated claims fact table and claim- and provider-level feature tables containing length of stay, diagnosis/procedure counts, duplicate and overcharge flags, peer-normalized z-scores, and 30/90/365-day aggregates used in analysis and modelling.</w:t>
-      </w:r>
-    </w:p>
-    <w:p>
-      <w:pPr>
-        <w:spacing w:line="360" w:lineRule="auto"/>
-        <w:rPr>
-          <w:rFonts w:ascii="Times New Roman" w:hAnsi="Times New Roman" w:cs="Times New Roman"/>
-          <w:b/>
-          <w:bCs/>
-          <w:i/>
-          <w:iCs/>
-          <w:sz w:val="24"/>
-          <w:szCs w:val="24"/>
-        </w:rPr>
-      </w:pPr>
-      <w:r>
-        <w:rPr>
-          <w:rFonts w:ascii="Times New Roman" w:hAnsi="Times New Roman" w:cs="Times New Roman"/>
-          <w:b/>
-          <w:bCs/>
-          <w:i/>
-          <w:iCs/>
-          <w:sz w:val="24"/>
-          <w:szCs w:val="24"/>
-        </w:rPr>
-        <w:t>3.3 Feature engineering and rule-based indicators</w:t>
-      </w:r>
-    </w:p>
-    <w:p>
-      <w:pPr>
-        <w:spacing w:after="240" w:line="360" w:lineRule="auto"/>
-        <w:rPr>
-          <w:rFonts w:ascii="Times New Roman" w:hAnsi="Times New Roman" w:cs="Times New Roman"/>
-          <w:sz w:val="24"/>
-          <w:szCs w:val="24"/>
-        </w:rPr>
-      </w:pPr>
-      <w:r>
-        <w:rPr>
-          <w:rFonts w:ascii="Times New Roman" w:hAnsi="Times New Roman" w:cs="Times New Roman"/>
-          <w:sz w:val="24"/>
-          <w:szCs w:val="24"/>
-        </w:rPr>
-        <w:t xml:space="preserve">We constructed features at both claim and provider levels and implemented simple rules to capture fraud patterns such as duplicate billing, upcoding, and overcharging, performing all feature engineering in SQL on top of the feature store and exporting the resulting tables to Python for modelling. At the claim level, we derived utilization and billing variables (reimbursed </w:t>
-      </w:r>
-      <w:r>
-        <w:rPr>
-          <w:rFonts w:ascii="Times New Roman" w:hAnsi="Times New Roman" w:cs="Times New Roman"/>
-          <w:sz w:val="24"/>
-          <w:szCs w:val="24"/>
-        </w:rPr>
-        <w:lastRenderedPageBreak/>
-        <w:t>amount, deductible, and, for inpatient claims, length of stay), counted diagnosis and procedure codes, and created indicators for “exact” and “near” duplicates by comparing claims for the same beneficiary and provider within short time windows with similar diagnosis–procedure combinations and amounts. We also defined overcharged flags using peer-normalized payment z-scores and IQR-based thresholds. At the provider level, we aggregated claims over 30-, 90-, and 365-day windows to obtain claims, reimbursement, unique beneficiaries, code diversity, inpatient/outpatient volumes, peer-normalized reimbursement and length-of-stay z-scores, counts of duplicate, upcoding, and overcharge events as inputs to subsequent models.</w:t>
-      </w:r>
-    </w:p>
-    <w:p>
-      <w:pPr>
-        <w:spacing w:line="360" w:lineRule="auto"/>
-        <w:rPr>
-          <w:rFonts w:ascii="Times New Roman" w:hAnsi="Times New Roman" w:cs="Times New Roman"/>
-          <w:b/>
-          <w:bCs/>
-          <w:i/>
-          <w:iCs/>
-          <w:sz w:val="24"/>
-          <w:szCs w:val="24"/>
-        </w:rPr>
-      </w:pPr>
-      <w:r>
-        <w:rPr>
-          <w:rFonts w:ascii="Times New Roman" w:hAnsi="Times New Roman" w:cs="Times New Roman"/>
-          <w:b/>
-          <w:bCs/>
-          <w:i/>
-          <w:iCs/>
-          <w:sz w:val="24"/>
-          <w:szCs w:val="24"/>
-        </w:rPr>
-        <w:t>3.4 Exploratory analysis and feature selection</w:t>
-      </w:r>
-    </w:p>
-    <w:p>
-      <w:pPr>
-        <w:spacing w:after="240" w:line="360" w:lineRule="auto"/>
-        <w:rPr>
-          <w:rFonts w:ascii="Times New Roman" w:hAnsi="Times New Roman" w:cs="Times New Roman"/>
-          <w:sz w:val="24"/>
-          <w:szCs w:val="24"/>
-        </w:rPr>
-      </w:pPr>
-      <w:r>
-        <w:rPr>
-          <w:rFonts w:ascii="Times New Roman" w:hAnsi="Times New Roman" w:cs="Times New Roman"/>
-          <w:sz w:val="24"/>
-          <w:szCs w:val="24"/>
-        </w:rPr>
-        <w:t>After building the SQL feature store, we performed exploratory analysis and feature selection in Python, using SQLAlchemy and pandas to load the claim- and provider-level feature tables and inspect basic distributions. For key continuous variables such as reimbursed amounts, deductibles, and inpatient length of stay, we plotted histograms and boxplots to assess skewness, long tails, and potential data errors, confirming the expected heavy-tailed patterns. We quantified outliers with robust statistics by computing interquartile ranges and robust z-scores based on the median and median absolute deviation, flagging extreme claims and comparing these to rule-based indicators such as overcharge flags and short-stay high-payment inpatient claims. At the provider level, we examined correlations among engineered features using pairwise correlation coefficients and variance inflation factors to identify and remove highly collinear variables, particularly overlapping measures of recent reimbursement and claim volumes. Based on these diagnostics, we retained a compact, interpretable set of provider features—covering total and recent reimbursement, recent claim and unique beneficiary counts, code diversity, peer-normalized reimbursement and length-of-stay z-scores, and aggregated counts of duplicate, upcoding, and overcharge events—for all subsequent supervised learning and clustering analyses.</w:t>
-      </w:r>
-    </w:p>
-    <w:p>
-      <w:pPr>
-        <w:spacing w:line="360" w:lineRule="auto"/>
-        <w:rPr>
-          <w:rFonts w:ascii="Times New Roman" w:hAnsi="Times New Roman" w:cs="Times New Roman"/>
-          <w:b/>
-          <w:bCs/>
-          <w:i/>
-          <w:iCs/>
-          <w:sz w:val="24"/>
-          <w:szCs w:val="24"/>
-        </w:rPr>
-      </w:pPr>
-      <w:r>
-        <w:rPr>
-          <w:rFonts w:ascii="Times New Roman" w:hAnsi="Times New Roman" w:cs="Times New Roman"/>
-          <w:b/>
-          <w:bCs/>
-          <w:i/>
-          <w:iCs/>
-          <w:sz w:val="24"/>
-          <w:szCs w:val="24"/>
-        </w:rPr>
-        <w:t>3.5 Unsupervised fraud-only claim clustering</w:t>
-      </w:r>
-    </w:p>
-    <w:p>
-      <w:pPr>
-        <w:spacing w:after="240" w:line="360" w:lineRule="auto"/>
-        <w:rPr>
-          <w:rFonts w:ascii="Times New Roman" w:hAnsi="Times New Roman" w:cs="Times New Roman"/>
-          <w:sz w:val="24"/>
-          <w:szCs w:val="24"/>
-        </w:rPr>
-      </w:pPr>
-      <w:r>
-        <w:rPr>
-          <w:rFonts w:ascii="Times New Roman" w:hAnsi="Times New Roman" w:cs="Times New Roman"/>
-          <w:sz w:val="24"/>
-          <w:szCs w:val="24"/>
-        </w:rPr>
-        <w:t xml:space="preserve">To better understand heterogeneity in fraudulent behavior, we clustered fraud-only claims. We first identified fraudulent providers from the training labels and extracted all associated inpatient and outpatient claims, building separate fraud-only tables. Using standardized engineered features—reimbursed amount, diagnosis and procedure counts, claim-level rule flags (duplicate </w:t>
-      </w:r>
-      <w:r>
-        <w:rPr>
-          <w:rFonts w:ascii="Times New Roman" w:hAnsi="Times New Roman" w:cs="Times New Roman"/>
-          <w:sz w:val="24"/>
-          <w:szCs w:val="24"/>
-        </w:rPr>
-        <w:lastRenderedPageBreak/>
-        <w:t>and overcharge), and peer-normalized z-scores—we imputed missing values, scaled features, and applied HDBSCAN separately to inpatient and outpatient claims, choosing it for its ability to find clusters of varying size and density while treating atypical claims as noise. We tuned minimum cluster size and minimum samples, evaluated clustering quality with internal metrics and the noise fraction, and visualized structure via PCA projections colored by HDBSCAN cluster assignments. For each cluster, we produced “cluster cards” summarizing size, reimbursement levels, diagnosis/procedure multiplicity, and frequencies of rule flags, and we ran association rule mining within clusters to find frequent, high-lift diagnosis–procedure combinations, using these summaries and patterns to characterize distinct types of fraudulent claim behavior.</w:t>
-      </w:r>
-    </w:p>
-    <w:p>
-      <w:pPr>
-        <w:spacing w:line="360" w:lineRule="auto"/>
-        <w:rPr>
-          <w:rFonts w:ascii="Times New Roman" w:hAnsi="Times New Roman" w:cs="Times New Roman"/>
-          <w:b/>
-          <w:bCs/>
-          <w:i/>
-          <w:iCs/>
-          <w:sz w:val="24"/>
-          <w:szCs w:val="24"/>
-        </w:rPr>
-      </w:pPr>
-      <w:r>
-        <w:rPr>
-          <w:rFonts w:ascii="Times New Roman" w:hAnsi="Times New Roman" w:cs="Times New Roman"/>
-          <w:b/>
-          <w:bCs/>
-          <w:i/>
-          <w:iCs/>
-          <w:sz w:val="24"/>
-          <w:szCs w:val="24"/>
-        </w:rPr>
-        <w:t>3.6 Supervised provider fraud classification</w:t>
-      </w:r>
-    </w:p>
-    <w:p>
-      <w:pPr>
-        <w:spacing w:after="240" w:line="360" w:lineRule="auto"/>
-        <w:rPr>
-          <w:rFonts w:ascii="Times New Roman" w:hAnsi="Times New Roman" w:cs="Times New Roman"/>
-          <w:sz w:val="24"/>
-          <w:szCs w:val="24"/>
-        </w:rPr>
-      </w:pPr>
-      <w:r>
-        <w:rPr>
-          <w:rFonts w:ascii="Times New Roman" w:hAnsi="Times New Roman" w:cs="Times New Roman"/>
-          <w:sz w:val="24"/>
-          <w:szCs w:val="24"/>
-        </w:rPr>
-        <w:t>We used supervised learning to predict whether a provider is fraudulent based on aggregated claims features. Modelling was restricted to labeled training providers, with a stratified 70/30 provider-level split that preserved the fraud/non-fraud ratio. All provider-level features from the feature store were merged with the binary fraud label, and continuous variables were standardized using statistics from the training subset, then applied unchanged to the hold-out set. We compared multiple classifiers on the same feature set—logistic regression with elastic-net regularization, Random Forests, Extremely Randomized Trees, LightGBM, XGBoost, and CatBoost—using class weighting or imbalance-aware parameters to address the rarity of fraudulent providers. Hyperparameters were tuned via randomized search with five-fold cross-validation, optimizing area under the precision–recall curve (PR-AUC), and final models were evaluated on the 30% hold-out set using accuracy, precision, recall, F1, PR-AUC, and ROC-AUC. Instead of fixing a 0.5 cutoff, we chose the probability threshold that maximized F1 on the hold-out precision–recall curve. Logistic regression with elastic-net and class-balanced weighting emerged as the primary model, offering strong PR-AUC, competitive F1, and interpretable coefficients, while tree-based models served as baselines that confirmed most performance gains came from the engineered features rather than model complexity.</w:t>
-      </w:r>
-    </w:p>
-    <w:p>
-      <w:pPr>
-        <w:spacing w:line="360" w:lineRule="auto"/>
-        <w:rPr>
-          <w:rFonts w:ascii="Times New Roman" w:hAnsi="Times New Roman" w:cs="Times New Roman"/>
-          <w:b/>
-          <w:bCs/>
-          <w:i/>
-          <w:iCs/>
-          <w:sz w:val="24"/>
-          <w:szCs w:val="24"/>
-        </w:rPr>
-      </w:pPr>
-      <w:r>
-        <w:rPr>
-          <w:rFonts w:ascii="Times New Roman" w:hAnsi="Times New Roman" w:cs="Times New Roman"/>
-          <w:b/>
-          <w:bCs/>
-          <w:i/>
-          <w:iCs/>
-          <w:sz w:val="24"/>
-          <w:szCs w:val="24"/>
-        </w:rPr>
-        <w:t>3.7 Provider fraud-type clustering</w:t>
-      </w:r>
-    </w:p>
-    <w:p>
-      <w:pPr>
-        <w:spacing w:after="100" w:afterAutospacing="1" w:line="360" w:lineRule="auto"/>
-        <w:rPr>
-          <w:rFonts w:ascii="Times New Roman" w:hAnsi="Times New Roman" w:cs="Times New Roman"/>
-          <w:sz w:val="24"/>
-          <w:szCs w:val="24"/>
-        </w:rPr>
-      </w:pPr>
-      <w:r>
-        <w:rPr>
-          <w:rFonts w:ascii="Times New Roman" w:hAnsi="Times New Roman" w:cs="Times New Roman"/>
-          <w:sz w:val="24"/>
-          <w:szCs w:val="24"/>
-        </w:rPr>
-        <w:t xml:space="preserve">Beyond predicting whether a provider is fraudulent, we also sought to characterize distinct fraud patterns among high-risk providers. We defined a high-risk universe by combining all labeled </w:t>
-      </w:r>
-      <w:r>
-        <w:rPr>
-          <w:rFonts w:ascii="Times New Roman" w:hAnsi="Times New Roman" w:cs="Times New Roman"/>
-          <w:sz w:val="24"/>
-          <w:szCs w:val="24"/>
-        </w:rPr>
-        <w:lastRenderedPageBreak/>
-        <w:t>fraudulent training providers with test providers whose logistic regression fraud scores exceeded a high threshold, then extracted the same standardized provider features used in supervised modeling (reimbursement levels, multi-window claims volumes, unique beneficiary counts, peer-normalized inpatient and outpatient z-scores, and rule counts for duplicates, upcoding, and overcharging). We applied HDBSCAN with Euclidean distance, a minimum cluster size of 10, and a small minimum samples value, allowing clusters of varying size and density and labeling atypical providers as noise. To examine structure, we projected providers into two principal components and colored points by cluster label, with noise in grey. For each cluster, we produced “cluster cards” summarizing size, labeled vs high-scored mix, and median utilization, payment, and rule-based features, interpreting them as fraud-type archetypes (e.g., high-revenue inpatient overchargers, high-volume outpatient overbillers).</w:t>
+          <w:highlight w:val="green"/>
+        </w:rPr>
+        <w:t xml:space="preserve">Recent studies document machine learning techniques for health insurance and Medicare fraud detection along with statistical models, ensemble learning, support vector machines, deep learning and hybrid pipelines [3], [8], [12], [14]. Logistic Regression, </w:t>
+      </w:r>
+      <w:r>
+        <w:rPr>
+          <w:rFonts w:ascii="Times New Roman" w:hAnsi="Times New Roman" w:cs="Times New Roman"/>
+          <w:sz w:val="24"/>
+          <w:szCs w:val="24"/>
+          <w:highlight w:val="green"/>
+        </w:rPr>
+        <w:t xml:space="preserve">Extra Trees, CatBoost, Random Forests, LightGBM, XGBoost, all of these supervised models are trained on provider and claim level data and perform well when the ground level truth label exists. </w:t>
+      </w:r>
+      <w:r>
+        <w:rPr>
+          <w:rFonts w:ascii="Times New Roman" w:hAnsi="Times New Roman" w:cs="Times New Roman"/>
+          <w:sz w:val="24"/>
+          <w:szCs w:val="24"/>
+          <w:highlight w:val="green"/>
+        </w:rPr>
+        <w:t>However</w:t>
+      </w:r>
+      <w:r>
+        <w:rPr>
+          <w:rFonts w:ascii="Times New Roman" w:hAnsi="Times New Roman" w:cs="Times New Roman"/>
+          <w:sz w:val="24"/>
+          <w:szCs w:val="24"/>
+          <w:highlight w:val="green"/>
+        </w:rPr>
+        <w:t xml:space="preserve">, </w:t>
+      </w:r>
+      <w:r>
+        <w:rPr>
+          <w:rFonts w:ascii="Times New Roman" w:hAnsi="Times New Roman" w:cs="Times New Roman"/>
+          <w:sz w:val="24"/>
+          <w:szCs w:val="24"/>
+          <w:highlight w:val="green"/>
+        </w:rPr>
+        <w:t xml:space="preserve">the </w:t>
+      </w:r>
+      <w:r>
+        <w:rPr>
+          <w:rFonts w:ascii="Times New Roman" w:hAnsi="Times New Roman" w:cs="Times New Roman"/>
+          <w:sz w:val="24"/>
+          <w:szCs w:val="24"/>
+          <w:highlight w:val="green"/>
+        </w:rPr>
+        <w:t>efficacy of those methods is not notable as the</w:t>
+      </w:r>
+      <w:r>
+        <w:rPr>
+          <w:rFonts w:ascii="Times New Roman" w:hAnsi="Times New Roman" w:cs="Times New Roman"/>
+          <w:sz w:val="24"/>
+          <w:szCs w:val="24"/>
+          <w:highlight w:val="green"/>
+        </w:rPr>
+        <w:t xml:space="preserve"> label scarcity</w:t>
+      </w:r>
+      <w:r>
+        <w:rPr>
+          <w:rFonts w:ascii="Times New Roman" w:hAnsi="Times New Roman" w:cs="Times New Roman"/>
+          <w:sz w:val="24"/>
+          <w:szCs w:val="24"/>
+          <w:highlight w:val="green"/>
+        </w:rPr>
+        <w:t xml:space="preserve"> exists</w:t>
+      </w:r>
+      <w:r>
+        <w:rPr>
+          <w:rFonts w:ascii="Times New Roman" w:hAnsi="Times New Roman" w:cs="Times New Roman"/>
+          <w:sz w:val="24"/>
+          <w:szCs w:val="24"/>
+          <w:highlight w:val="green"/>
+        </w:rPr>
+        <w:t xml:space="preserve"> and </w:t>
+      </w:r>
+      <w:r>
+        <w:rPr>
+          <w:rFonts w:ascii="Times New Roman" w:hAnsi="Times New Roman" w:cs="Times New Roman"/>
+          <w:sz w:val="24"/>
+          <w:szCs w:val="24"/>
+          <w:highlight w:val="green"/>
+        </w:rPr>
+        <w:t xml:space="preserve"> </w:t>
+      </w:r>
+      <w:r>
+        <w:rPr>
+          <w:rFonts w:ascii="Times New Roman" w:hAnsi="Times New Roman" w:cs="Times New Roman"/>
+          <w:sz w:val="24"/>
+          <w:szCs w:val="24"/>
+          <w:highlight w:val="green"/>
+        </w:rPr>
+        <w:t>fraud patterns</w:t>
+      </w:r>
+      <w:r>
+        <w:rPr>
+          <w:rFonts w:ascii="Times New Roman" w:hAnsi="Times New Roman" w:cs="Times New Roman"/>
+          <w:sz w:val="24"/>
+          <w:szCs w:val="24"/>
+          <w:highlight w:val="green"/>
+        </w:rPr>
+        <w:t xml:space="preserve"> evolve quickly</w:t>
+      </w:r>
+      <w:r>
+        <w:rPr>
+          <w:rFonts w:ascii="Times New Roman" w:hAnsi="Times New Roman" w:cs="Times New Roman"/>
+          <w:sz w:val="24"/>
+          <w:szCs w:val="24"/>
+          <w:highlight w:val="green"/>
+        </w:rPr>
+        <w:t xml:space="preserve"> [3], [5], [7], [8], [11]. </w:t>
+      </w:r>
+      <w:r>
+        <w:rPr>
+          <w:rFonts w:ascii="Times New Roman" w:hAnsi="Times New Roman" w:cs="Times New Roman"/>
+          <w:sz w:val="24"/>
+          <w:szCs w:val="24"/>
+          <w:highlight w:val="green"/>
+        </w:rPr>
+        <w:t>K</w:t>
+      </w:r>
+      <w:r>
+        <w:rPr>
+          <w:rFonts w:ascii="Times New Roman" w:hAnsi="Times New Roman" w:cs="Times New Roman"/>
+          <w:sz w:val="24"/>
+          <w:szCs w:val="24"/>
+          <w:highlight w:val="green"/>
+        </w:rPr>
+        <w:t>-means</w:t>
+      </w:r>
+      <w:r>
+        <w:rPr>
+          <w:rFonts w:ascii="Times New Roman" w:hAnsi="Times New Roman" w:cs="Times New Roman"/>
+          <w:sz w:val="24"/>
+          <w:szCs w:val="24"/>
+          <w:highlight w:val="green"/>
+        </w:rPr>
+        <w:t xml:space="preserve"> clustering</w:t>
+      </w:r>
+      <w:r>
+        <w:rPr>
+          <w:rFonts w:ascii="Times New Roman" w:hAnsi="Times New Roman" w:cs="Times New Roman"/>
+          <w:sz w:val="24"/>
+          <w:szCs w:val="24"/>
+          <w:highlight w:val="green"/>
+        </w:rPr>
+        <w:t xml:space="preserve"> and</w:t>
+      </w:r>
+      <w:r>
+        <w:rPr>
+          <w:rFonts w:ascii="Times New Roman" w:hAnsi="Times New Roman" w:cs="Times New Roman"/>
+          <w:sz w:val="24"/>
+          <w:szCs w:val="24"/>
+          <w:highlight w:val="green"/>
+        </w:rPr>
+        <w:t xml:space="preserve"> </w:t>
+      </w:r>
+      <w:r>
+        <w:rPr>
+          <w:rFonts w:ascii="Times New Roman" w:hAnsi="Times New Roman" w:cs="Times New Roman"/>
+          <w:sz w:val="24"/>
+          <w:szCs w:val="24"/>
+          <w:highlight w:val="green"/>
+        </w:rPr>
+        <w:t xml:space="preserve">other </w:t>
+      </w:r>
+      <w:r>
+        <w:rPr>
+          <w:rFonts w:ascii="Times New Roman" w:hAnsi="Times New Roman" w:cs="Times New Roman"/>
+          <w:sz w:val="24"/>
+          <w:szCs w:val="24"/>
+          <w:highlight w:val="green"/>
+        </w:rPr>
+        <w:t>density-based approaches</w:t>
+      </w:r>
+      <w:r>
+        <w:rPr>
+          <w:rFonts w:ascii="Times New Roman" w:hAnsi="Times New Roman" w:cs="Times New Roman"/>
+          <w:sz w:val="24"/>
+          <w:szCs w:val="24"/>
+          <w:highlight w:val="green"/>
+        </w:rPr>
+        <w:t xml:space="preserve"> discover different</w:t>
+      </w:r>
+      <w:r>
+        <w:rPr>
+          <w:rFonts w:ascii="Times New Roman" w:hAnsi="Times New Roman" w:cs="Times New Roman"/>
+          <w:sz w:val="24"/>
+          <w:szCs w:val="24"/>
+          <w:highlight w:val="green"/>
+        </w:rPr>
+        <w:t xml:space="preserve"> types </w:t>
+      </w:r>
+      <w:r>
+        <w:rPr>
+          <w:rFonts w:ascii="Times New Roman" w:hAnsi="Times New Roman" w:cs="Times New Roman"/>
+          <w:sz w:val="24"/>
+          <w:szCs w:val="24"/>
+          <w:highlight w:val="green"/>
+        </w:rPr>
+        <w:t xml:space="preserve">of fraud </w:t>
+      </w:r>
+      <w:r>
+        <w:rPr>
+          <w:rFonts w:ascii="Times New Roman" w:hAnsi="Times New Roman" w:cs="Times New Roman"/>
+          <w:sz w:val="24"/>
+          <w:szCs w:val="24"/>
+          <w:highlight w:val="green"/>
+        </w:rPr>
+        <w:t>across the</w:t>
+      </w:r>
+      <w:r>
+        <w:rPr>
+          <w:rFonts w:ascii="Times New Roman" w:hAnsi="Times New Roman" w:cs="Times New Roman"/>
+          <w:sz w:val="24"/>
+          <w:szCs w:val="24"/>
+          <w:highlight w:val="green"/>
+        </w:rPr>
+        <w:t xml:space="preserve"> claims </w:t>
+      </w:r>
+      <w:r>
+        <w:rPr>
+          <w:rFonts w:ascii="Times New Roman" w:hAnsi="Times New Roman" w:cs="Times New Roman"/>
+          <w:sz w:val="24"/>
+          <w:szCs w:val="24"/>
+          <w:highlight w:val="green"/>
+        </w:rPr>
+        <w:t>and</w:t>
+      </w:r>
+      <w:r>
+        <w:rPr>
+          <w:rFonts w:ascii="Times New Roman" w:hAnsi="Times New Roman" w:cs="Times New Roman"/>
+          <w:sz w:val="24"/>
+          <w:szCs w:val="24"/>
+          <w:highlight w:val="green"/>
+        </w:rPr>
+        <w:t xml:space="preserve"> providers</w:t>
+      </w:r>
+      <w:r>
+        <w:rPr>
+          <w:rFonts w:ascii="Times New Roman" w:hAnsi="Times New Roman" w:cs="Times New Roman"/>
+          <w:sz w:val="24"/>
+          <w:szCs w:val="24"/>
+          <w:highlight w:val="green"/>
+        </w:rPr>
+        <w:t>.</w:t>
+      </w:r>
+      <w:r>
+        <w:rPr>
+          <w:rFonts w:ascii="Times New Roman" w:hAnsi="Times New Roman" w:cs="Times New Roman"/>
+          <w:sz w:val="24"/>
+          <w:szCs w:val="24"/>
+          <w:highlight w:val="green"/>
+        </w:rPr>
+        <w:t xml:space="preserve"> Th</w:t>
+      </w:r>
+      <w:r>
+        <w:rPr>
+          <w:rFonts w:ascii="Times New Roman" w:hAnsi="Times New Roman" w:cs="Times New Roman"/>
+          <w:sz w:val="24"/>
+          <w:szCs w:val="24"/>
+          <w:highlight w:val="green"/>
+        </w:rPr>
+        <w:t>ose</w:t>
+      </w:r>
+      <w:r>
+        <w:rPr>
+          <w:rFonts w:ascii="Times New Roman" w:hAnsi="Times New Roman" w:cs="Times New Roman"/>
+          <w:sz w:val="24"/>
+          <w:szCs w:val="24"/>
+          <w:highlight w:val="green"/>
+        </w:rPr>
+        <w:t xml:space="preserve"> detectors</w:t>
+      </w:r>
+      <w:r>
+        <w:rPr>
+          <w:rFonts w:ascii="Times New Roman" w:hAnsi="Times New Roman" w:cs="Times New Roman"/>
+          <w:sz w:val="24"/>
+          <w:szCs w:val="24"/>
+          <w:highlight w:val="green"/>
+        </w:rPr>
+        <w:t xml:space="preserve"> </w:t>
+      </w:r>
+      <w:r>
+        <w:rPr>
+          <w:rFonts w:ascii="Times New Roman" w:hAnsi="Times New Roman" w:cs="Times New Roman"/>
+          <w:sz w:val="24"/>
+          <w:szCs w:val="24"/>
+          <w:highlight w:val="green"/>
+        </w:rPr>
+        <w:t xml:space="preserve">rely heavily on feature </w:t>
+      </w:r>
+      <w:r>
+        <w:rPr>
+          <w:rFonts w:ascii="Times New Roman" w:hAnsi="Times New Roman" w:cs="Times New Roman"/>
+          <w:sz w:val="24"/>
+          <w:szCs w:val="24"/>
+          <w:highlight w:val="green"/>
+        </w:rPr>
+        <w:t>engineering which also yield</w:t>
+      </w:r>
+      <w:r>
+        <w:rPr>
+          <w:rFonts w:ascii="Times New Roman" w:hAnsi="Times New Roman" w:cs="Times New Roman"/>
+          <w:sz w:val="24"/>
+          <w:szCs w:val="24"/>
+          <w:highlight w:val="green"/>
+        </w:rPr>
+        <w:t xml:space="preserve"> high false positive cases</w:t>
+      </w:r>
+      <w:r>
+        <w:rPr>
+          <w:rFonts w:ascii="Times New Roman" w:hAnsi="Times New Roman" w:cs="Times New Roman"/>
+          <w:sz w:val="24"/>
+          <w:szCs w:val="24"/>
+          <w:highlight w:val="green"/>
+        </w:rPr>
+        <w:t xml:space="preserve"> and human verification is essential to reduce the rate of misclassification</w:t>
+      </w:r>
+      <w:r>
+        <w:rPr>
+          <w:rFonts w:ascii="Times New Roman" w:hAnsi="Times New Roman" w:cs="Times New Roman"/>
+          <w:sz w:val="24"/>
+          <w:szCs w:val="24"/>
+          <w:highlight w:val="green"/>
+        </w:rPr>
+        <w:t xml:space="preserve"> [1], [2], [6], [13], [15]. </w:t>
+      </w:r>
+      <w:r>
+        <w:rPr>
+          <w:rFonts w:ascii="Times New Roman" w:hAnsi="Times New Roman" w:cs="Times New Roman"/>
+          <w:sz w:val="24"/>
+          <w:szCs w:val="24"/>
+          <w:highlight w:val="green"/>
+        </w:rPr>
+        <w:t xml:space="preserve">Association rule mining comes in handy for tagging those suspicious groups as several fraudulent types. </w:t>
+      </w:r>
+      <w:r>
+        <w:rPr>
+          <w:rFonts w:ascii="Times New Roman" w:hAnsi="Times New Roman" w:cs="Times New Roman"/>
+          <w:sz w:val="24"/>
+          <w:szCs w:val="24"/>
+          <w:highlight w:val="green"/>
+        </w:rPr>
+        <w:t>It helps</w:t>
+      </w:r>
+      <w:r>
+        <w:rPr>
+          <w:rFonts w:ascii="Times New Roman" w:hAnsi="Times New Roman" w:cs="Times New Roman"/>
+          <w:sz w:val="24"/>
+          <w:szCs w:val="24"/>
+          <w:highlight w:val="green"/>
+        </w:rPr>
+        <w:t xml:space="preserve"> detect</w:t>
+      </w:r>
+      <w:r>
+        <w:rPr>
+          <w:rFonts w:ascii="Times New Roman" w:hAnsi="Times New Roman" w:cs="Times New Roman"/>
+          <w:sz w:val="24"/>
+          <w:szCs w:val="24"/>
+          <w:highlight w:val="green"/>
+        </w:rPr>
+        <w:t xml:space="preserve"> </w:t>
+      </w:r>
+      <w:r>
+        <w:rPr>
+          <w:rFonts w:ascii="Times New Roman" w:hAnsi="Times New Roman" w:cs="Times New Roman"/>
+          <w:sz w:val="24"/>
+          <w:szCs w:val="24"/>
+          <w:highlight w:val="green"/>
+        </w:rPr>
+        <w:t>specifically</w:t>
+      </w:r>
+      <w:r>
+        <w:rPr>
+          <w:rFonts w:ascii="Times New Roman" w:hAnsi="Times New Roman" w:cs="Times New Roman"/>
+          <w:sz w:val="24"/>
+          <w:szCs w:val="24"/>
+          <w:highlight w:val="green"/>
+        </w:rPr>
+        <w:t xml:space="preserve"> whether the cluster represents duplicates, upcoding</w:t>
+      </w:r>
+      <w:r>
+        <w:rPr>
+          <w:rFonts w:ascii="Times New Roman" w:hAnsi="Times New Roman" w:cs="Times New Roman"/>
+          <w:sz w:val="24"/>
+          <w:szCs w:val="24"/>
+          <w:highlight w:val="green"/>
+        </w:rPr>
+        <w:t>,</w:t>
+      </w:r>
+      <w:r>
+        <w:rPr>
+          <w:rFonts w:ascii="Times New Roman" w:hAnsi="Times New Roman" w:cs="Times New Roman"/>
+          <w:sz w:val="24"/>
+          <w:szCs w:val="24"/>
+          <w:highlight w:val="green"/>
+        </w:rPr>
+        <w:t xml:space="preserve"> overcharge</w:t>
+      </w:r>
+      <w:r>
+        <w:rPr>
+          <w:rFonts w:ascii="Times New Roman" w:hAnsi="Times New Roman" w:cs="Times New Roman"/>
+          <w:sz w:val="24"/>
+          <w:szCs w:val="24"/>
+          <w:highlight w:val="green"/>
+        </w:rPr>
+        <w:t xml:space="preserve"> or any other fraud</w:t>
+      </w:r>
+      <w:r>
+        <w:rPr>
+          <w:rFonts w:ascii="Times New Roman" w:hAnsi="Times New Roman" w:cs="Times New Roman"/>
+          <w:sz w:val="24"/>
+          <w:szCs w:val="24"/>
+          <w:highlight w:val="green"/>
+        </w:rPr>
+        <w:t xml:space="preserve"> </w:t>
+      </w:r>
+      <w:r>
+        <w:rPr>
+          <w:rFonts w:ascii="Times New Roman" w:hAnsi="Times New Roman" w:cs="Times New Roman"/>
+          <w:sz w:val="24"/>
+          <w:szCs w:val="24"/>
+          <w:highlight w:val="green"/>
+        </w:rPr>
+        <w:t>patterns</w:t>
+      </w:r>
+      <w:r>
+        <w:rPr>
+          <w:rFonts w:ascii="Times New Roman" w:hAnsi="Times New Roman" w:cs="Times New Roman"/>
+          <w:sz w:val="24"/>
+          <w:szCs w:val="24"/>
+          <w:highlight w:val="green"/>
+        </w:rPr>
+        <w:t xml:space="preserve"> [5], [10]. Current research in this field </w:t>
+      </w:r>
+      <w:r>
+        <w:rPr>
+          <w:rFonts w:ascii="Times New Roman" w:hAnsi="Times New Roman" w:cs="Times New Roman"/>
+          <w:sz w:val="24"/>
+          <w:szCs w:val="24"/>
+          <w:highlight w:val="green"/>
+        </w:rPr>
+        <w:t>emphasizes</w:t>
+      </w:r>
+      <w:r>
+        <w:rPr>
+          <w:rFonts w:ascii="Times New Roman" w:hAnsi="Times New Roman" w:cs="Times New Roman"/>
+          <w:sz w:val="24"/>
+          <w:szCs w:val="24"/>
+          <w:highlight w:val="green"/>
+        </w:rPr>
+        <w:t xml:space="preserve"> </w:t>
+      </w:r>
+      <w:r>
+        <w:rPr>
+          <w:rFonts w:ascii="Times New Roman" w:hAnsi="Times New Roman" w:cs="Times New Roman"/>
+          <w:sz w:val="24"/>
+          <w:szCs w:val="24"/>
+          <w:highlight w:val="green"/>
+        </w:rPr>
+        <w:t>designing the hybrid models, supervised and unsupervised detectors within the</w:t>
+      </w:r>
+      <w:r>
+        <w:rPr>
+          <w:rFonts w:ascii="Times New Roman" w:hAnsi="Times New Roman" w:cs="Times New Roman"/>
+          <w:sz w:val="24"/>
+          <w:szCs w:val="24"/>
+          <w:highlight w:val="green"/>
+        </w:rPr>
+        <w:t xml:space="preserve"> end-to-end</w:t>
+      </w:r>
+      <w:r>
+        <w:rPr>
+          <w:rFonts w:ascii="Times New Roman" w:hAnsi="Times New Roman" w:cs="Times New Roman"/>
+          <w:sz w:val="24"/>
+          <w:szCs w:val="24"/>
+          <w:highlight w:val="green"/>
+        </w:rPr>
+        <w:t xml:space="preserve"> pipeline [3], [8], [12], [14], [15].</w:t>
       </w:r>
     </w:p>
     <w:p>
@@ -1014,6 +1506,1588 @@
           <w:sz w:val="28"/>
           <w:szCs w:val="28"/>
         </w:rPr>
+        <w:lastRenderedPageBreak/>
+        <w:t>3. Methodology</w:t>
+      </w:r>
+    </w:p>
+    <w:p>
+      <w:pPr>
+        <w:spacing w:line="360" w:lineRule="auto"/>
+        <w:rPr>
+          <w:rFonts w:ascii="Times New Roman" w:hAnsi="Times New Roman" w:cs="Times New Roman"/>
+          <w:b/>
+          <w:bCs/>
+          <w:i/>
+          <w:iCs/>
+          <w:sz w:val="24"/>
+          <w:szCs w:val="24"/>
+        </w:rPr>
+      </w:pPr>
+      <w:r>
+        <w:rPr>
+          <w:rFonts w:ascii="Times New Roman" w:hAnsi="Times New Roman" w:cs="Times New Roman"/>
+          <w:b/>
+          <w:bCs/>
+          <w:i/>
+          <w:iCs/>
+          <w:sz w:val="24"/>
+          <w:szCs w:val="24"/>
+        </w:rPr>
+        <w:t>3.1. Data sources and study design</w:t>
+      </w:r>
+    </w:p>
+    <w:p>
+      <w:pPr>
+        <w:spacing w:after="240" w:line="360" w:lineRule="auto"/>
+        <w:rPr>
+          <w:rFonts w:ascii="Times New Roman" w:hAnsi="Times New Roman" w:cs="Times New Roman"/>
+          <w:sz w:val="24"/>
+          <w:szCs w:val="24"/>
+        </w:rPr>
+      </w:pPr>
+      <w:r>
+        <w:rPr>
+          <w:rFonts w:ascii="Times New Roman" w:hAnsi="Times New Roman" w:cs="Times New Roman"/>
+          <w:sz w:val="24"/>
+          <w:szCs w:val="24"/>
+          <w:highlight w:val="green"/>
+        </w:rPr>
+        <w:t xml:space="preserve">We </w:t>
+      </w:r>
+      <w:r>
+        <w:rPr>
+          <w:rFonts w:ascii="Times New Roman" w:hAnsi="Times New Roman" w:cs="Times New Roman"/>
+          <w:sz w:val="24"/>
+          <w:szCs w:val="24"/>
+          <w:highlight w:val="green"/>
+        </w:rPr>
+        <w:t xml:space="preserve">used the Medicare </w:t>
+      </w:r>
+      <w:r>
+        <w:rPr>
+          <w:rFonts w:ascii="Times New Roman" w:hAnsi="Times New Roman" w:cs="Times New Roman"/>
+          <w:sz w:val="24"/>
+          <w:szCs w:val="24"/>
+          <w:highlight w:val="green"/>
+        </w:rPr>
+        <w:t>dataset from Medical Sphere</w:t>
+      </w:r>
+      <w:r>
+        <w:rPr>
+          <w:rFonts w:ascii="Times New Roman" w:hAnsi="Times New Roman" w:cs="Times New Roman"/>
+          <w:sz w:val="24"/>
+          <w:szCs w:val="24"/>
+          <w:highlight w:val="green"/>
+        </w:rPr>
+        <w:t xml:space="preserve"> (Open Source) which comes</w:t>
+      </w:r>
+      <w:r>
+        <w:rPr>
+          <w:rFonts w:ascii="Times New Roman" w:hAnsi="Times New Roman" w:cs="Times New Roman"/>
+          <w:sz w:val="24"/>
+          <w:szCs w:val="24"/>
+          <w:highlight w:val="green"/>
+        </w:rPr>
+        <w:t xml:space="preserve"> with </w:t>
+      </w:r>
+      <w:r>
+        <w:rPr>
+          <w:rFonts w:ascii="Times New Roman" w:hAnsi="Times New Roman" w:cs="Times New Roman"/>
+          <w:sz w:val="24"/>
+          <w:szCs w:val="24"/>
+          <w:highlight w:val="green"/>
+        </w:rPr>
+        <w:t xml:space="preserve">4 </w:t>
+      </w:r>
+      <w:r>
+        <w:rPr>
+          <w:rFonts w:ascii="Times New Roman" w:hAnsi="Times New Roman" w:cs="Times New Roman"/>
+          <w:sz w:val="24"/>
+          <w:szCs w:val="24"/>
+          <w:highlight w:val="green"/>
+        </w:rPr>
+        <w:t>training and</w:t>
+      </w:r>
+      <w:r>
+        <w:rPr>
+          <w:rFonts w:ascii="Times New Roman" w:hAnsi="Times New Roman" w:cs="Times New Roman"/>
+          <w:sz w:val="24"/>
+          <w:szCs w:val="24"/>
+          <w:highlight w:val="green"/>
+        </w:rPr>
+        <w:t xml:space="preserve"> 4</w:t>
+      </w:r>
+      <w:r>
+        <w:rPr>
+          <w:rFonts w:ascii="Times New Roman" w:hAnsi="Times New Roman" w:cs="Times New Roman"/>
+          <w:sz w:val="24"/>
+          <w:szCs w:val="24"/>
+          <w:highlight w:val="green"/>
+        </w:rPr>
+        <w:t xml:space="preserve"> test </w:t>
+      </w:r>
+      <w:r>
+        <w:rPr>
+          <w:rFonts w:ascii="Times New Roman" w:hAnsi="Times New Roman" w:cs="Times New Roman"/>
+          <w:sz w:val="24"/>
+          <w:szCs w:val="24"/>
+          <w:highlight w:val="green"/>
+        </w:rPr>
+        <w:t>files</w:t>
+      </w:r>
+      <w:r>
+        <w:rPr>
+          <w:rFonts w:ascii="Times New Roman" w:hAnsi="Times New Roman" w:cs="Times New Roman"/>
+          <w:sz w:val="24"/>
+          <w:szCs w:val="24"/>
+          <w:highlight w:val="green"/>
+        </w:rPr>
+        <w:t xml:space="preserve">. </w:t>
+      </w:r>
+      <w:r>
+        <w:rPr>
+          <w:rFonts w:ascii="Times New Roman" w:hAnsi="Times New Roman" w:cs="Times New Roman"/>
+          <w:sz w:val="24"/>
+          <w:szCs w:val="24"/>
+          <w:highlight w:val="green"/>
+        </w:rPr>
+        <w:t>Both of them</w:t>
+      </w:r>
+      <w:r>
+        <w:rPr>
+          <w:rFonts w:ascii="Times New Roman" w:hAnsi="Times New Roman" w:cs="Times New Roman"/>
+          <w:sz w:val="24"/>
+          <w:szCs w:val="24"/>
+          <w:highlight w:val="green"/>
+        </w:rPr>
+        <w:t xml:space="preserve"> h</w:t>
+      </w:r>
+      <w:r>
+        <w:rPr>
+          <w:rFonts w:ascii="Times New Roman" w:hAnsi="Times New Roman" w:cs="Times New Roman"/>
+          <w:sz w:val="24"/>
+          <w:szCs w:val="24"/>
+          <w:highlight w:val="green"/>
+        </w:rPr>
+        <w:t>ave</w:t>
+      </w:r>
+      <w:r>
+        <w:rPr>
+          <w:rFonts w:ascii="Times New Roman" w:hAnsi="Times New Roman" w:cs="Times New Roman"/>
+          <w:sz w:val="24"/>
+          <w:szCs w:val="24"/>
+          <w:highlight w:val="green"/>
+        </w:rPr>
+        <w:t xml:space="preserve"> provider, inpatient claims, outpatient claims, and beneficiary</w:t>
+      </w:r>
+      <w:r>
+        <w:rPr>
+          <w:rFonts w:ascii="Times New Roman" w:hAnsi="Times New Roman" w:cs="Times New Roman"/>
+          <w:sz w:val="24"/>
+          <w:szCs w:val="24"/>
+          <w:highlight w:val="green"/>
+        </w:rPr>
+        <w:t xml:space="preserve"> tables</w:t>
+      </w:r>
+      <w:r>
+        <w:rPr>
+          <w:rFonts w:ascii="Times New Roman" w:hAnsi="Times New Roman" w:cs="Times New Roman"/>
+          <w:sz w:val="24"/>
+          <w:szCs w:val="24"/>
+          <w:highlight w:val="green"/>
+        </w:rPr>
+        <w:t xml:space="preserve">. The training provider table includes a </w:t>
+      </w:r>
+      <w:r>
+        <w:rPr>
+          <w:rFonts w:ascii="Times New Roman" w:hAnsi="Times New Roman" w:cs="Times New Roman"/>
+          <w:i/>
+          <w:iCs/>
+          <w:sz w:val="24"/>
+          <w:szCs w:val="24"/>
+          <w:highlight w:val="green"/>
+        </w:rPr>
+        <w:t>PotentialFraud</w:t>
+      </w:r>
+      <w:r>
+        <w:rPr>
+          <w:rFonts w:ascii="Times New Roman" w:hAnsi="Times New Roman" w:cs="Times New Roman"/>
+          <w:sz w:val="24"/>
+          <w:szCs w:val="24"/>
+          <w:highlight w:val="green"/>
+        </w:rPr>
+        <w:t xml:space="preserve"> flag. Inpatient and outpatient tables contain </w:t>
+      </w:r>
+      <w:r>
+        <w:rPr>
+          <w:rFonts w:ascii="Times New Roman" w:hAnsi="Times New Roman" w:cs="Times New Roman"/>
+          <w:sz w:val="24"/>
+          <w:szCs w:val="24"/>
+          <w:highlight w:val="green"/>
+        </w:rPr>
+        <w:t>each row</w:t>
+      </w:r>
+      <w:r>
+        <w:rPr>
+          <w:rFonts w:ascii="Times New Roman" w:hAnsi="Times New Roman" w:cs="Times New Roman"/>
+          <w:sz w:val="24"/>
+          <w:szCs w:val="24"/>
+          <w:highlight w:val="green"/>
+        </w:rPr>
+        <w:t xml:space="preserve"> with claim</w:t>
+      </w:r>
+      <w:r>
+        <w:rPr>
+          <w:rFonts w:ascii="Times New Roman" w:hAnsi="Times New Roman" w:cs="Times New Roman"/>
+          <w:sz w:val="24"/>
+          <w:szCs w:val="24"/>
+          <w:highlight w:val="green"/>
+        </w:rPr>
+        <w:t xml:space="preserve"> IDs</w:t>
+      </w:r>
+      <w:r>
+        <w:rPr>
+          <w:rFonts w:ascii="Times New Roman" w:hAnsi="Times New Roman" w:cs="Times New Roman"/>
+          <w:sz w:val="24"/>
+          <w:szCs w:val="24"/>
+          <w:highlight w:val="green"/>
+        </w:rPr>
+        <w:t>, beneficiary</w:t>
+      </w:r>
+      <w:r>
+        <w:rPr>
+          <w:rFonts w:ascii="Times New Roman" w:hAnsi="Times New Roman" w:cs="Times New Roman"/>
+          <w:sz w:val="24"/>
+          <w:szCs w:val="24"/>
+          <w:highlight w:val="green"/>
+        </w:rPr>
+        <w:t xml:space="preserve"> IDs</w:t>
+      </w:r>
+      <w:r>
+        <w:rPr>
+          <w:rFonts w:ascii="Times New Roman" w:hAnsi="Times New Roman" w:cs="Times New Roman"/>
+          <w:sz w:val="24"/>
+          <w:szCs w:val="24"/>
+          <w:highlight w:val="green"/>
+        </w:rPr>
+        <w:t>, provider IDs, dates, reimbursed amount, deductibles, and diagnosis/procedure codes</w:t>
+      </w:r>
+      <w:r>
+        <w:rPr>
+          <w:rFonts w:ascii="Times New Roman" w:hAnsi="Times New Roman" w:cs="Times New Roman"/>
+          <w:sz w:val="24"/>
+          <w:szCs w:val="24"/>
+          <w:highlight w:val="green"/>
+        </w:rPr>
+        <w:t>.</w:t>
+      </w:r>
+      <w:r>
+        <w:rPr>
+          <w:rFonts w:ascii="Times New Roman" w:hAnsi="Times New Roman" w:cs="Times New Roman"/>
+          <w:sz w:val="24"/>
+          <w:szCs w:val="24"/>
+          <w:highlight w:val="green"/>
+        </w:rPr>
+        <w:t xml:space="preserve"> </w:t>
+      </w:r>
+      <w:r>
+        <w:rPr>
+          <w:rFonts w:ascii="Times New Roman" w:hAnsi="Times New Roman" w:cs="Times New Roman"/>
+          <w:sz w:val="24"/>
+          <w:szCs w:val="24"/>
+          <w:highlight w:val="green"/>
+        </w:rPr>
+        <w:t>T</w:t>
+      </w:r>
+      <w:r>
+        <w:rPr>
+          <w:rFonts w:ascii="Times New Roman" w:hAnsi="Times New Roman" w:cs="Times New Roman"/>
+          <w:sz w:val="24"/>
+          <w:szCs w:val="24"/>
+          <w:highlight w:val="green"/>
+        </w:rPr>
+        <w:t>he inpatient table also has admission</w:t>
+      </w:r>
+      <w:r>
+        <w:rPr>
+          <w:rFonts w:ascii="Times New Roman" w:hAnsi="Times New Roman" w:cs="Times New Roman"/>
+          <w:sz w:val="24"/>
+          <w:szCs w:val="24"/>
+          <w:highlight w:val="green"/>
+        </w:rPr>
+        <w:t xml:space="preserve">, </w:t>
+      </w:r>
+      <w:r>
+        <w:rPr>
+          <w:rFonts w:ascii="Times New Roman" w:hAnsi="Times New Roman" w:cs="Times New Roman"/>
+          <w:sz w:val="24"/>
+          <w:szCs w:val="24"/>
+          <w:highlight w:val="green"/>
+        </w:rPr>
+        <w:t xml:space="preserve">discharge dates and diagnosis-group fields. The beneficiary table </w:t>
+      </w:r>
+      <w:r>
+        <w:rPr>
+          <w:rFonts w:ascii="Times New Roman" w:hAnsi="Times New Roman" w:cs="Times New Roman"/>
+          <w:sz w:val="24"/>
+          <w:szCs w:val="24"/>
+          <w:highlight w:val="green"/>
+        </w:rPr>
+        <w:t>contains</w:t>
+      </w:r>
+      <w:r>
+        <w:rPr>
+          <w:rFonts w:ascii="Times New Roman" w:hAnsi="Times New Roman" w:cs="Times New Roman"/>
+          <w:sz w:val="24"/>
+          <w:szCs w:val="24"/>
+          <w:highlight w:val="green"/>
+        </w:rPr>
+        <w:t xml:space="preserve"> </w:t>
+      </w:r>
+      <w:r>
+        <w:rPr>
+          <w:rFonts w:ascii="Times New Roman" w:hAnsi="Times New Roman" w:cs="Times New Roman"/>
+          <w:sz w:val="24"/>
+          <w:szCs w:val="24"/>
+          <w:highlight w:val="green"/>
+        </w:rPr>
+        <w:t xml:space="preserve">basic </w:t>
+      </w:r>
+      <w:r>
+        <w:rPr>
+          <w:rFonts w:ascii="Times New Roman" w:hAnsi="Times New Roman" w:cs="Times New Roman"/>
+          <w:sz w:val="24"/>
+          <w:szCs w:val="24"/>
+          <w:highlight w:val="green"/>
+        </w:rPr>
+        <w:t>patient information</w:t>
+      </w:r>
+      <w:r>
+        <w:rPr>
+          <w:rFonts w:ascii="Times New Roman" w:hAnsi="Times New Roman" w:cs="Times New Roman"/>
+          <w:sz w:val="24"/>
+          <w:szCs w:val="24"/>
+          <w:highlight w:val="green"/>
+        </w:rPr>
+        <w:t>,</w:t>
+      </w:r>
+      <w:r>
+        <w:rPr>
+          <w:rFonts w:ascii="Times New Roman" w:hAnsi="Times New Roman" w:cs="Times New Roman"/>
+          <w:sz w:val="24"/>
+          <w:szCs w:val="24"/>
+          <w:highlight w:val="green"/>
+        </w:rPr>
+        <w:t xml:space="preserve"> demographics,</w:t>
+      </w:r>
+      <w:r>
+        <w:rPr>
+          <w:rFonts w:ascii="Times New Roman" w:hAnsi="Times New Roman" w:cs="Times New Roman"/>
+          <w:sz w:val="24"/>
+          <w:szCs w:val="24"/>
+          <w:highlight w:val="green"/>
+        </w:rPr>
+        <w:t xml:space="preserve"> and chronic condition indicators.</w:t>
+      </w:r>
+      <w:r>
+        <w:rPr>
+          <w:rFonts w:ascii="Times New Roman" w:hAnsi="Times New Roman" w:cs="Times New Roman"/>
+          <w:sz w:val="24"/>
+          <w:szCs w:val="24"/>
+          <w:highlight w:val="green"/>
+        </w:rPr>
+        <w:t xml:space="preserve"> </w:t>
+      </w:r>
+      <w:r>
+        <w:rPr>
+          <w:rFonts w:ascii="Times New Roman" w:hAnsi="Times New Roman" w:cs="Times New Roman"/>
+          <w:sz w:val="24"/>
+          <w:szCs w:val="24"/>
+          <w:highlight w:val="green"/>
+        </w:rPr>
+        <w:t>W</w:t>
+      </w:r>
+      <w:r>
+        <w:rPr>
+          <w:rFonts w:ascii="Times New Roman" w:hAnsi="Times New Roman" w:cs="Times New Roman"/>
+          <w:sz w:val="24"/>
+          <w:szCs w:val="24"/>
+          <w:highlight w:val="green"/>
+        </w:rPr>
+        <w:t>e c</w:t>
+      </w:r>
+      <w:r>
+        <w:rPr>
+          <w:rFonts w:ascii="Times New Roman" w:hAnsi="Times New Roman" w:cs="Times New Roman"/>
+          <w:sz w:val="24"/>
+          <w:szCs w:val="24"/>
+          <w:highlight w:val="green"/>
+        </w:rPr>
+        <w:t>ompute</w:t>
+      </w:r>
+      <w:r>
+        <w:rPr>
+          <w:rFonts w:ascii="Times New Roman" w:hAnsi="Times New Roman" w:cs="Times New Roman"/>
+          <w:sz w:val="24"/>
+          <w:szCs w:val="24"/>
+          <w:highlight w:val="green"/>
+        </w:rPr>
+        <w:t>d</w:t>
+      </w:r>
+      <w:r>
+        <w:rPr>
+          <w:rFonts w:ascii="Times New Roman" w:hAnsi="Times New Roman" w:cs="Times New Roman"/>
+          <w:sz w:val="24"/>
+          <w:szCs w:val="24"/>
+          <w:highlight w:val="green"/>
+        </w:rPr>
+        <w:t xml:space="preserve"> the</w:t>
+      </w:r>
+      <w:r>
+        <w:rPr>
+          <w:rFonts w:ascii="Times New Roman" w:hAnsi="Times New Roman" w:cs="Times New Roman"/>
+          <w:sz w:val="24"/>
+          <w:szCs w:val="24"/>
+          <w:highlight w:val="green"/>
+        </w:rPr>
+        <w:t xml:space="preserve"> several statistical features including mean, median and z-scores on payments, length of stay alongside the aggregates such as total claims, total reimbursement amounts, total number of unique beneficiaries</w:t>
+      </w:r>
+      <w:r>
+        <w:rPr>
+          <w:rFonts w:ascii="Times New Roman" w:hAnsi="Times New Roman" w:cs="Times New Roman"/>
+          <w:sz w:val="24"/>
+          <w:szCs w:val="24"/>
+          <w:highlight w:val="green"/>
+        </w:rPr>
+        <w:t xml:space="preserve"> on different timeframes</w:t>
+      </w:r>
+      <w:r>
+        <w:rPr>
+          <w:rFonts w:ascii="Times New Roman" w:hAnsi="Times New Roman" w:cs="Times New Roman"/>
+          <w:sz w:val="24"/>
+          <w:szCs w:val="24"/>
+          <w:highlight w:val="green"/>
+        </w:rPr>
+        <w:t xml:space="preserve"> </w:t>
+      </w:r>
+      <w:r>
+        <w:rPr>
+          <w:rFonts w:ascii="Times New Roman" w:hAnsi="Times New Roman" w:cs="Times New Roman"/>
+          <w:sz w:val="24"/>
+          <w:szCs w:val="24"/>
+          <w:highlight w:val="green"/>
+        </w:rPr>
+        <w:t>(30/90/365 days)</w:t>
+      </w:r>
+      <w:r>
+        <w:rPr>
+          <w:rFonts w:ascii="Times New Roman" w:hAnsi="Times New Roman" w:cs="Times New Roman"/>
+          <w:sz w:val="24"/>
+          <w:szCs w:val="24"/>
+          <w:highlight w:val="green"/>
+        </w:rPr>
+        <w:t xml:space="preserve"> to classify the fraudulent providers</w:t>
+      </w:r>
+      <w:r>
+        <w:rPr>
+          <w:rFonts w:ascii="Times New Roman" w:hAnsi="Times New Roman" w:cs="Times New Roman"/>
+          <w:sz w:val="24"/>
+          <w:szCs w:val="24"/>
+          <w:highlight w:val="green"/>
+        </w:rPr>
+        <w:t>. We u</w:t>
+      </w:r>
+      <w:r>
+        <w:rPr>
+          <w:rFonts w:ascii="Times New Roman" w:hAnsi="Times New Roman" w:cs="Times New Roman"/>
+          <w:sz w:val="24"/>
+          <w:szCs w:val="24"/>
+          <w:highlight w:val="green"/>
+        </w:rPr>
+        <w:t>tilized</w:t>
+      </w:r>
+      <w:r>
+        <w:rPr>
+          <w:rFonts w:ascii="Times New Roman" w:hAnsi="Times New Roman" w:cs="Times New Roman"/>
+          <w:sz w:val="24"/>
+          <w:szCs w:val="24"/>
+          <w:highlight w:val="green"/>
+        </w:rPr>
+        <w:t xml:space="preserve"> </w:t>
+      </w:r>
+      <w:r>
+        <w:rPr>
+          <w:rFonts w:ascii="Times New Roman" w:hAnsi="Times New Roman" w:cs="Times New Roman"/>
+          <w:sz w:val="24"/>
+          <w:szCs w:val="24"/>
+          <w:highlight w:val="green"/>
+        </w:rPr>
+        <w:t xml:space="preserve">claims </w:t>
+      </w:r>
+      <w:r>
+        <w:rPr>
+          <w:rFonts w:ascii="Times New Roman" w:hAnsi="Times New Roman" w:cs="Times New Roman"/>
+          <w:sz w:val="24"/>
+          <w:szCs w:val="24"/>
+          <w:highlight w:val="green"/>
+        </w:rPr>
+        <w:t xml:space="preserve">data </w:t>
+      </w:r>
+      <w:r>
+        <w:rPr>
+          <w:rFonts w:ascii="Times New Roman" w:hAnsi="Times New Roman" w:cs="Times New Roman"/>
+          <w:sz w:val="24"/>
+          <w:szCs w:val="24"/>
+          <w:highlight w:val="green"/>
+        </w:rPr>
+        <w:t xml:space="preserve">for feature construction and </w:t>
+      </w:r>
+      <w:r>
+        <w:rPr>
+          <w:rFonts w:ascii="Times New Roman" w:hAnsi="Times New Roman" w:cs="Times New Roman"/>
+          <w:sz w:val="24"/>
+          <w:szCs w:val="24"/>
+          <w:highlight w:val="green"/>
+        </w:rPr>
+        <w:t xml:space="preserve">performed </w:t>
+      </w:r>
+      <w:r>
+        <w:rPr>
+          <w:rFonts w:ascii="Times New Roman" w:hAnsi="Times New Roman" w:cs="Times New Roman"/>
+          <w:sz w:val="24"/>
+          <w:szCs w:val="24"/>
+          <w:highlight w:val="green"/>
+        </w:rPr>
+        <w:t>unsupervised clustering on fraud-only claims. For supervised learning</w:t>
+      </w:r>
+      <w:r>
+        <w:rPr>
+          <w:rFonts w:ascii="Times New Roman" w:hAnsi="Times New Roman" w:cs="Times New Roman"/>
+          <w:sz w:val="24"/>
+          <w:szCs w:val="24"/>
+          <w:highlight w:val="green"/>
+        </w:rPr>
+        <w:t>,</w:t>
+      </w:r>
+      <w:r>
+        <w:rPr>
+          <w:rFonts w:ascii="Times New Roman" w:hAnsi="Times New Roman" w:cs="Times New Roman"/>
+          <w:sz w:val="24"/>
+          <w:szCs w:val="24"/>
+          <w:highlight w:val="green"/>
+        </w:rPr>
+        <w:t xml:space="preserve"> we </w:t>
+      </w:r>
+      <w:r>
+        <w:rPr>
+          <w:rFonts w:ascii="Times New Roman" w:hAnsi="Times New Roman" w:cs="Times New Roman"/>
+          <w:sz w:val="24"/>
+          <w:szCs w:val="24"/>
+          <w:highlight w:val="green"/>
+        </w:rPr>
+        <w:t>trained our models on</w:t>
+      </w:r>
+      <w:r>
+        <w:rPr>
+          <w:rFonts w:ascii="Times New Roman" w:hAnsi="Times New Roman" w:cs="Times New Roman"/>
+          <w:sz w:val="24"/>
+          <w:szCs w:val="24"/>
+          <w:highlight w:val="green"/>
+        </w:rPr>
+        <w:t xml:space="preserve"> 70</w:t>
+      </w:r>
+      <w:r>
+        <w:rPr>
+          <w:rFonts w:ascii="Times New Roman" w:hAnsi="Times New Roman" w:cs="Times New Roman"/>
+          <w:sz w:val="24"/>
+          <w:szCs w:val="24"/>
+          <w:highlight w:val="green"/>
+        </w:rPr>
+        <w:t xml:space="preserve">% of the training data, we kept </w:t>
+      </w:r>
+      <w:r>
+        <w:rPr>
+          <w:rFonts w:ascii="Times New Roman" w:hAnsi="Times New Roman" w:cs="Times New Roman"/>
+          <w:sz w:val="24"/>
+          <w:szCs w:val="24"/>
+          <w:highlight w:val="green"/>
+        </w:rPr>
+        <w:t xml:space="preserve">30% data </w:t>
+      </w:r>
+      <w:r>
+        <w:rPr>
+          <w:rFonts w:ascii="Times New Roman" w:hAnsi="Times New Roman" w:cs="Times New Roman"/>
+          <w:sz w:val="24"/>
+          <w:szCs w:val="24"/>
+          <w:highlight w:val="green"/>
+        </w:rPr>
+        <w:t>for evaluation</w:t>
+      </w:r>
+      <w:r>
+        <w:rPr>
+          <w:rFonts w:ascii="Times New Roman" w:hAnsi="Times New Roman" w:cs="Times New Roman"/>
+          <w:sz w:val="24"/>
+          <w:szCs w:val="24"/>
+          <w:highlight w:val="green"/>
+        </w:rPr>
+        <w:t>.</w:t>
+      </w:r>
+      <w:r>
+        <w:rPr>
+          <w:rFonts w:ascii="Times New Roman" w:hAnsi="Times New Roman" w:cs="Times New Roman"/>
+          <w:sz w:val="24"/>
+          <w:szCs w:val="24"/>
+          <w:highlight w:val="green"/>
+        </w:rPr>
+        <w:t xml:space="preserve"> </w:t>
+      </w:r>
+      <w:r>
+        <w:rPr>
+          <w:rFonts w:ascii="Times New Roman" w:hAnsi="Times New Roman" w:cs="Times New Roman"/>
+          <w:sz w:val="24"/>
+          <w:szCs w:val="24"/>
+          <w:highlight w:val="green"/>
+        </w:rPr>
+        <w:t>W</w:t>
+      </w:r>
+      <w:r>
+        <w:rPr>
+          <w:rFonts w:ascii="Times New Roman" w:hAnsi="Times New Roman" w:cs="Times New Roman"/>
+          <w:sz w:val="24"/>
+          <w:szCs w:val="24"/>
+          <w:highlight w:val="green"/>
+        </w:rPr>
+        <w:t xml:space="preserve">e </w:t>
+      </w:r>
+      <w:r>
+        <w:rPr>
+          <w:rFonts w:ascii="Times New Roman" w:hAnsi="Times New Roman" w:cs="Times New Roman"/>
+          <w:sz w:val="24"/>
+          <w:szCs w:val="24"/>
+          <w:highlight w:val="green"/>
+        </w:rPr>
+        <w:t xml:space="preserve">then </w:t>
+      </w:r>
+      <w:r>
+        <w:rPr>
+          <w:rFonts w:ascii="Times New Roman" w:hAnsi="Times New Roman" w:cs="Times New Roman"/>
+          <w:sz w:val="24"/>
+          <w:szCs w:val="24"/>
+          <w:highlight w:val="green"/>
+        </w:rPr>
+        <w:t>appl</w:t>
+      </w:r>
+      <w:r>
+        <w:rPr>
+          <w:rFonts w:ascii="Times New Roman" w:hAnsi="Times New Roman" w:cs="Times New Roman"/>
+          <w:sz w:val="24"/>
+          <w:szCs w:val="24"/>
+          <w:highlight w:val="green"/>
+        </w:rPr>
+        <w:t>ied</w:t>
+      </w:r>
+      <w:r>
+        <w:rPr>
+          <w:rFonts w:ascii="Times New Roman" w:hAnsi="Times New Roman" w:cs="Times New Roman"/>
+          <w:sz w:val="24"/>
+          <w:szCs w:val="24"/>
+          <w:highlight w:val="green"/>
+        </w:rPr>
+        <w:t xml:space="preserve"> the</w:t>
+      </w:r>
+      <w:r>
+        <w:rPr>
+          <w:rFonts w:ascii="Times New Roman" w:hAnsi="Times New Roman" w:cs="Times New Roman"/>
+          <w:sz w:val="24"/>
+          <w:szCs w:val="24"/>
+          <w:highlight w:val="green"/>
+        </w:rPr>
+        <w:t xml:space="preserve"> trained models on</w:t>
+      </w:r>
+      <w:r>
+        <w:rPr>
+          <w:rFonts w:ascii="Times New Roman" w:hAnsi="Times New Roman" w:cs="Times New Roman"/>
+          <w:sz w:val="24"/>
+          <w:szCs w:val="24"/>
+          <w:highlight w:val="green"/>
+        </w:rPr>
+        <w:t xml:space="preserve"> unlabeled test </w:t>
+      </w:r>
+      <w:r>
+        <w:rPr>
+          <w:rFonts w:ascii="Times New Roman" w:hAnsi="Times New Roman" w:cs="Times New Roman"/>
+          <w:sz w:val="24"/>
+          <w:szCs w:val="24"/>
+          <w:highlight w:val="green"/>
+        </w:rPr>
+        <w:t>data</w:t>
+      </w:r>
+      <w:r>
+        <w:rPr>
+          <w:rFonts w:ascii="Times New Roman" w:hAnsi="Times New Roman" w:cs="Times New Roman"/>
+          <w:sz w:val="24"/>
+          <w:szCs w:val="24"/>
+          <w:highlight w:val="green"/>
+        </w:rPr>
+        <w:t xml:space="preserve"> to </w:t>
+      </w:r>
+      <w:r>
+        <w:rPr>
+          <w:rFonts w:ascii="Times New Roman" w:hAnsi="Times New Roman" w:cs="Times New Roman"/>
+          <w:sz w:val="24"/>
+          <w:szCs w:val="24"/>
+          <w:highlight w:val="green"/>
+        </w:rPr>
+        <w:t>examine</w:t>
+      </w:r>
+      <w:r>
+        <w:rPr>
+          <w:rFonts w:ascii="Times New Roman" w:hAnsi="Times New Roman" w:cs="Times New Roman"/>
+          <w:sz w:val="24"/>
+          <w:szCs w:val="24"/>
+          <w:highlight w:val="green"/>
+        </w:rPr>
+        <w:t xml:space="preserve"> risk scores and labels for </w:t>
+      </w:r>
+      <w:r>
+        <w:rPr>
+          <w:rFonts w:ascii="Times New Roman" w:hAnsi="Times New Roman" w:cs="Times New Roman"/>
+          <w:sz w:val="24"/>
+          <w:szCs w:val="24"/>
+          <w:highlight w:val="green"/>
+        </w:rPr>
+        <w:t xml:space="preserve">characterizing the </w:t>
+      </w:r>
+      <w:r>
+        <w:rPr>
+          <w:rFonts w:ascii="Times New Roman" w:hAnsi="Times New Roman" w:cs="Times New Roman"/>
+          <w:sz w:val="24"/>
+          <w:szCs w:val="24"/>
+          <w:highlight w:val="green"/>
+        </w:rPr>
+        <w:t>provider</w:t>
+      </w:r>
+      <w:r>
+        <w:rPr>
+          <w:rFonts w:ascii="Times New Roman" w:hAnsi="Times New Roman" w:cs="Times New Roman"/>
+          <w:sz w:val="24"/>
+          <w:szCs w:val="24"/>
+          <w:highlight w:val="green"/>
+        </w:rPr>
+        <w:t>-clusters</w:t>
+      </w:r>
+      <w:r>
+        <w:rPr>
+          <w:rFonts w:ascii="Times New Roman" w:hAnsi="Times New Roman" w:cs="Times New Roman"/>
+          <w:sz w:val="24"/>
+          <w:szCs w:val="24"/>
+          <w:highlight w:val="green"/>
+        </w:rPr>
+        <w:t>.</w:t>
+      </w:r>
+    </w:p>
+    <w:p>
+      <w:pPr>
+        <w:spacing w:line="360" w:lineRule="auto"/>
+        <w:rPr>
+          <w:rFonts w:ascii="Times New Roman" w:hAnsi="Times New Roman" w:cs="Times New Roman"/>
+          <w:b/>
+          <w:bCs/>
+          <w:i/>
+          <w:iCs/>
+          <w:sz w:val="24"/>
+          <w:szCs w:val="24"/>
+        </w:rPr>
+      </w:pPr>
+      <w:r>
+        <w:rPr>
+          <w:rFonts w:ascii="Times New Roman" w:hAnsi="Times New Roman" w:cs="Times New Roman"/>
+          <w:b/>
+          <w:bCs/>
+          <w:i/>
+          <w:iCs/>
+          <w:sz w:val="24"/>
+          <w:szCs w:val="24"/>
+        </w:rPr>
+        <w:t>3.2 Data cleaning and SQL feature store</w:t>
+      </w:r>
+    </w:p>
+    <w:p>
+      <w:pPr>
+        <w:spacing w:after="100" w:afterAutospacing="1" w:line="360" w:lineRule="auto"/>
+        <w:rPr>
+          <w:rFonts w:ascii="Times New Roman" w:hAnsi="Times New Roman" w:cs="Times New Roman"/>
+          <w:sz w:val="24"/>
+          <w:szCs w:val="24"/>
+        </w:rPr>
+      </w:pPr>
+      <w:r>
+        <w:rPr>
+          <w:rFonts w:ascii="Times New Roman" w:hAnsi="Times New Roman" w:cs="Times New Roman"/>
+          <w:sz w:val="24"/>
+          <w:szCs w:val="24"/>
+          <w:highlight w:val="green"/>
+        </w:rPr>
+        <w:t xml:space="preserve">All data processing was implemented in PostgreSQL using a layered design. </w:t>
+      </w:r>
+      <w:r>
+        <w:rPr>
+          <w:rFonts w:ascii="Times New Roman" w:hAnsi="Times New Roman" w:cs="Times New Roman"/>
+          <w:sz w:val="24"/>
+          <w:szCs w:val="24"/>
+          <w:highlight w:val="green"/>
+        </w:rPr>
+        <w:t>We loaded r</w:t>
+      </w:r>
+      <w:r>
+        <w:rPr>
+          <w:rFonts w:ascii="Times New Roman" w:hAnsi="Times New Roman" w:cs="Times New Roman"/>
+          <w:sz w:val="24"/>
+          <w:szCs w:val="24"/>
+          <w:highlight w:val="green"/>
+        </w:rPr>
+        <w:t>a</w:t>
+      </w:r>
+      <w:r>
+        <w:rPr>
+          <w:rFonts w:ascii="Times New Roman" w:hAnsi="Times New Roman" w:cs="Times New Roman"/>
+          <w:sz w:val="24"/>
+          <w:szCs w:val="24"/>
+          <w:highlight w:val="green"/>
+        </w:rPr>
+        <w:t>w csv files</w:t>
+      </w:r>
+      <w:r>
+        <w:rPr>
+          <w:rFonts w:ascii="Times New Roman" w:hAnsi="Times New Roman" w:cs="Times New Roman"/>
+          <w:sz w:val="24"/>
+          <w:szCs w:val="24"/>
+          <w:highlight w:val="green"/>
+        </w:rPr>
+        <w:t xml:space="preserve"> into a staging schema with all fields as text and basic checks on structure and column counts. Cleaned data moved to a curated schema, where placeholder strings for missing values were converted to NULL and columns cast to appropriate types</w:t>
+      </w:r>
+      <w:r>
+        <w:rPr>
+          <w:rFonts w:ascii="Times New Roman" w:hAnsi="Times New Roman" w:cs="Times New Roman"/>
+          <w:sz w:val="24"/>
+          <w:szCs w:val="24"/>
+          <w:highlight w:val="green"/>
+        </w:rPr>
+        <w:t xml:space="preserve">. </w:t>
+      </w:r>
+      <w:r>
+        <w:rPr>
+          <w:rFonts w:ascii="Times New Roman" w:hAnsi="Times New Roman" w:cs="Times New Roman"/>
+          <w:sz w:val="24"/>
+          <w:szCs w:val="24"/>
+          <w:highlight w:val="green"/>
+        </w:rPr>
+        <w:t>We went through data processing steps to verify unique provider and beneficiary IDs. We made sure there were non-null values in all the features across the inpatient and outpatient tables. We also looked into valid foreign keys and non-negative payments, length of stay and other numeric features. After handling those checks, we put together a mart schema where we had a fact table in place along with feature tables focused on claims and providers. These tables contain details about the length of stay, code counts for diagnoses and procedures, duplicates, possible overcharges, peer-normalized z-scores and 30/90/365-day aggregates.</w:t>
+      </w:r>
+    </w:p>
+    <w:p>
+      <w:pPr>
+        <w:spacing w:line="360" w:lineRule="auto"/>
+        <w:rPr>
+          <w:rFonts w:ascii="Times New Roman" w:hAnsi="Times New Roman" w:cs="Times New Roman"/>
+          <w:b/>
+          <w:bCs/>
+          <w:i/>
+          <w:iCs/>
+          <w:sz w:val="24"/>
+          <w:szCs w:val="24"/>
+        </w:rPr>
+      </w:pPr>
+      <w:r>
+        <w:rPr>
+          <w:rFonts w:ascii="Times New Roman" w:hAnsi="Times New Roman" w:cs="Times New Roman"/>
+          <w:b/>
+          <w:bCs/>
+          <w:i/>
+          <w:iCs/>
+          <w:sz w:val="24"/>
+          <w:szCs w:val="24"/>
+        </w:rPr>
+        <w:t>3.3 Feature engineering and rule-based indicators</w:t>
+      </w:r>
+    </w:p>
+    <w:p>
+      <w:pPr>
+        <w:spacing w:after="240" w:line="360" w:lineRule="auto"/>
+        <w:rPr>
+          <w:rFonts w:ascii="Times New Roman" w:hAnsi="Times New Roman" w:cs="Times New Roman"/>
+          <w:sz w:val="24"/>
+          <w:szCs w:val="24"/>
+        </w:rPr>
+      </w:pPr>
+      <w:r>
+        <w:rPr>
+          <w:rFonts w:ascii="Times New Roman" w:hAnsi="Times New Roman" w:cs="Times New Roman"/>
+          <w:sz w:val="24"/>
+          <w:szCs w:val="24"/>
+          <w:highlight w:val="green"/>
+        </w:rPr>
+        <w:lastRenderedPageBreak/>
+        <w:t>We derived f</w:t>
+      </w:r>
+      <w:r>
+        <w:rPr>
+          <w:rFonts w:ascii="Times New Roman" w:hAnsi="Times New Roman" w:cs="Times New Roman"/>
+          <w:sz w:val="24"/>
+          <w:szCs w:val="24"/>
+          <w:highlight w:val="green"/>
+        </w:rPr>
+        <w:t xml:space="preserve">eatures at both claim and provider levels. We implemented simple rules to capture duplicate billing, upcoding, overcharging, and other fraud patterns. We worked on reimbursed amount, deductible, length of stay, counted the diagnosis and procedure counts at the claim level depending on the type of the patient. We also built rule indicators for exact or near duplicates by comparing for the same patient and provider within short timeframes. </w:t>
+      </w:r>
+      <w:r>
+        <w:rPr>
+          <w:rFonts w:ascii="Times New Roman" w:hAnsi="Times New Roman" w:cs="Times New Roman"/>
+          <w:sz w:val="24"/>
+          <w:szCs w:val="24"/>
+          <w:highlight w:val="yellow"/>
+        </w:rPr>
+        <w:t>For overcharging, w</w:t>
+      </w:r>
+      <w:r>
+        <w:rPr>
+          <w:rFonts w:ascii="Times New Roman" w:hAnsi="Times New Roman" w:cs="Times New Roman"/>
+          <w:sz w:val="24"/>
+          <w:szCs w:val="24"/>
+          <w:highlight w:val="yellow"/>
+        </w:rPr>
+        <w:t xml:space="preserve">e </w:t>
+      </w:r>
+      <w:r>
+        <w:rPr>
+          <w:rFonts w:ascii="Times New Roman" w:hAnsi="Times New Roman" w:cs="Times New Roman"/>
+          <w:sz w:val="24"/>
+          <w:szCs w:val="24"/>
+          <w:highlight w:val="yellow"/>
+        </w:rPr>
+        <w:t>marked</w:t>
+      </w:r>
+      <w:r>
+        <w:rPr>
+          <w:rFonts w:ascii="Times New Roman" w:hAnsi="Times New Roman" w:cs="Times New Roman"/>
+          <w:sz w:val="24"/>
+          <w:szCs w:val="24"/>
+          <w:highlight w:val="yellow"/>
+        </w:rPr>
+        <w:t xml:space="preserve"> cases</w:t>
+      </w:r>
+      <w:r>
+        <w:rPr>
+          <w:rFonts w:ascii="Times New Roman" w:hAnsi="Times New Roman" w:cs="Times New Roman"/>
+          <w:sz w:val="24"/>
+          <w:szCs w:val="24"/>
+          <w:highlight w:val="yellow"/>
+        </w:rPr>
+        <w:t xml:space="preserve"> with </w:t>
+      </w:r>
+      <w:r>
+        <w:rPr>
+          <w:rFonts w:ascii="Times New Roman" w:hAnsi="Times New Roman" w:cs="Times New Roman"/>
+          <w:sz w:val="24"/>
+          <w:szCs w:val="24"/>
+          <w:highlight w:val="yellow"/>
+        </w:rPr>
+        <w:t>peer-normalized z-scores</w:t>
+      </w:r>
+      <w:r>
+        <w:rPr>
+          <w:rFonts w:ascii="Times New Roman" w:hAnsi="Times New Roman" w:cs="Times New Roman"/>
+          <w:sz w:val="24"/>
+          <w:szCs w:val="24"/>
+          <w:highlight w:val="yellow"/>
+        </w:rPr>
+        <w:t xml:space="preserve"> </w:t>
+      </w:r>
+      <w:r>
+        <w:rPr>
+          <w:rFonts w:ascii="Times New Roman" w:hAnsi="Times New Roman" w:cs="Times New Roman"/>
+          <w:sz w:val="24"/>
+          <w:szCs w:val="24"/>
+          <w:highlight w:val="yellow"/>
+        </w:rPr>
+        <w:t>for payments along with</w:t>
+      </w:r>
+      <w:r>
+        <w:rPr>
+          <w:rFonts w:ascii="Times New Roman" w:hAnsi="Times New Roman" w:cs="Times New Roman"/>
+          <w:sz w:val="24"/>
+          <w:szCs w:val="24"/>
+          <w:highlight w:val="yellow"/>
+        </w:rPr>
+        <w:t xml:space="preserve"> IQR</w:t>
+      </w:r>
+      <w:r>
+        <w:rPr>
+          <w:rFonts w:ascii="Times New Roman" w:hAnsi="Times New Roman" w:cs="Times New Roman"/>
+          <w:sz w:val="24"/>
+          <w:szCs w:val="24"/>
+          <w:highlight w:val="yellow"/>
+        </w:rPr>
+        <w:t xml:space="preserve"> thresholds. </w:t>
+      </w:r>
+      <w:r>
+        <w:rPr>
+          <w:rFonts w:ascii="Times New Roman" w:hAnsi="Times New Roman" w:cs="Times New Roman"/>
+          <w:sz w:val="24"/>
+          <w:szCs w:val="24"/>
+          <w:highlight w:val="yellow"/>
+        </w:rPr>
+        <w:t>W</w:t>
+      </w:r>
+      <w:r>
+        <w:rPr>
+          <w:rFonts w:ascii="Times New Roman" w:hAnsi="Times New Roman" w:cs="Times New Roman"/>
+          <w:sz w:val="24"/>
+          <w:szCs w:val="24"/>
+          <w:highlight w:val="yellow"/>
+        </w:rPr>
+        <w:t xml:space="preserve">e </w:t>
+      </w:r>
+      <w:r>
+        <w:rPr>
+          <w:rFonts w:ascii="Times New Roman" w:hAnsi="Times New Roman" w:cs="Times New Roman"/>
+          <w:sz w:val="24"/>
+          <w:szCs w:val="24"/>
+          <w:highlight w:val="yellow"/>
+        </w:rPr>
+        <w:t xml:space="preserve">also </w:t>
+      </w:r>
+      <w:r>
+        <w:rPr>
+          <w:rFonts w:ascii="Times New Roman" w:hAnsi="Times New Roman" w:cs="Times New Roman"/>
+          <w:sz w:val="24"/>
+          <w:szCs w:val="24"/>
+          <w:highlight w:val="yellow"/>
+        </w:rPr>
+        <w:t>grouped</w:t>
+      </w:r>
+      <w:r>
+        <w:rPr>
+          <w:rFonts w:ascii="Times New Roman" w:hAnsi="Times New Roman" w:cs="Times New Roman"/>
+          <w:sz w:val="24"/>
+          <w:szCs w:val="24"/>
+          <w:highlight w:val="yellow"/>
+        </w:rPr>
+        <w:t xml:space="preserve"> claims across windows of </w:t>
+      </w:r>
+      <w:r>
+        <w:rPr>
+          <w:rFonts w:ascii="Times New Roman" w:hAnsi="Times New Roman" w:cs="Times New Roman"/>
+          <w:sz w:val="24"/>
+          <w:szCs w:val="24"/>
+          <w:highlight w:val="yellow"/>
+        </w:rPr>
+        <w:t>30</w:t>
+      </w:r>
+      <w:r>
+        <w:rPr>
+          <w:rFonts w:ascii="Times New Roman" w:hAnsi="Times New Roman" w:cs="Times New Roman"/>
+          <w:sz w:val="24"/>
+          <w:szCs w:val="24"/>
+          <w:highlight w:val="yellow"/>
+        </w:rPr>
+        <w:t xml:space="preserve">, </w:t>
+      </w:r>
+      <w:r>
+        <w:rPr>
+          <w:rFonts w:ascii="Times New Roman" w:hAnsi="Times New Roman" w:cs="Times New Roman"/>
+          <w:sz w:val="24"/>
+          <w:szCs w:val="24"/>
+          <w:highlight w:val="yellow"/>
+        </w:rPr>
+        <w:t>90</w:t>
+      </w:r>
+      <w:r>
+        <w:rPr>
+          <w:rFonts w:ascii="Times New Roman" w:hAnsi="Times New Roman" w:cs="Times New Roman"/>
+          <w:sz w:val="24"/>
+          <w:szCs w:val="24"/>
+          <w:highlight w:val="yellow"/>
+        </w:rPr>
+        <w:t xml:space="preserve">, and </w:t>
+      </w:r>
+      <w:r>
+        <w:rPr>
+          <w:rFonts w:ascii="Times New Roman" w:hAnsi="Times New Roman" w:cs="Times New Roman"/>
+          <w:sz w:val="24"/>
+          <w:szCs w:val="24"/>
+          <w:highlight w:val="yellow"/>
+        </w:rPr>
+        <w:t>365</w:t>
+      </w:r>
+      <w:r>
+        <w:rPr>
+          <w:rFonts w:ascii="Times New Roman" w:hAnsi="Times New Roman" w:cs="Times New Roman"/>
+          <w:sz w:val="24"/>
+          <w:szCs w:val="24"/>
+          <w:highlight w:val="yellow"/>
+        </w:rPr>
+        <w:t xml:space="preserve"> days</w:t>
+      </w:r>
+      <w:r>
+        <w:rPr>
+          <w:rFonts w:ascii="Times New Roman" w:hAnsi="Times New Roman" w:cs="Times New Roman"/>
+          <w:sz w:val="24"/>
+          <w:szCs w:val="24"/>
+          <w:highlight w:val="yellow"/>
+        </w:rPr>
+        <w:t xml:space="preserve">. This lets us get totals on claims and payments, </w:t>
+      </w:r>
+      <w:r>
+        <w:rPr>
+          <w:rFonts w:ascii="Times New Roman" w:hAnsi="Times New Roman" w:cs="Times New Roman"/>
+          <w:sz w:val="24"/>
+          <w:szCs w:val="24"/>
+          <w:highlight w:val="yellow"/>
+        </w:rPr>
+        <w:t xml:space="preserve">numbers of unique patients, </w:t>
+      </w:r>
+      <w:r>
+        <w:rPr>
+          <w:rFonts w:ascii="Times New Roman" w:hAnsi="Times New Roman" w:cs="Times New Roman"/>
+          <w:sz w:val="24"/>
+          <w:szCs w:val="24"/>
+          <w:highlight w:val="yellow"/>
+        </w:rPr>
+        <w:t>diversity</w:t>
+      </w:r>
+      <w:r>
+        <w:rPr>
+          <w:rFonts w:ascii="Times New Roman" w:hAnsi="Times New Roman" w:cs="Times New Roman"/>
+          <w:sz w:val="24"/>
+          <w:szCs w:val="24"/>
+          <w:highlight w:val="yellow"/>
+        </w:rPr>
+        <w:t xml:space="preserve"> in diagnosis</w:t>
+      </w:r>
+      <w:r>
+        <w:rPr>
+          <w:rFonts w:ascii="Times New Roman" w:hAnsi="Times New Roman" w:cs="Times New Roman"/>
+          <w:sz w:val="24"/>
+          <w:szCs w:val="24"/>
+          <w:highlight w:val="yellow"/>
+        </w:rPr>
+        <w:t>/</w:t>
+      </w:r>
+      <w:r>
+        <w:rPr>
+          <w:rFonts w:ascii="Times New Roman" w:hAnsi="Times New Roman" w:cs="Times New Roman"/>
+          <w:sz w:val="24"/>
+          <w:szCs w:val="24"/>
+          <w:highlight w:val="yellow"/>
+        </w:rPr>
+        <w:t>procedure codes</w:t>
+      </w:r>
+      <w:r>
+        <w:rPr>
+          <w:rFonts w:ascii="Times New Roman" w:hAnsi="Times New Roman" w:cs="Times New Roman"/>
+          <w:sz w:val="24"/>
+          <w:szCs w:val="24"/>
+          <w:highlight w:val="yellow"/>
+        </w:rPr>
+        <w:t xml:space="preserve"> </w:t>
+      </w:r>
+      <w:r>
+        <w:rPr>
+          <w:rFonts w:ascii="Times New Roman" w:hAnsi="Times New Roman" w:cs="Times New Roman"/>
+          <w:sz w:val="24"/>
+          <w:szCs w:val="24"/>
+          <w:highlight w:val="yellow"/>
+        </w:rPr>
+        <w:t>and</w:t>
+      </w:r>
+      <w:r>
+        <w:rPr>
+          <w:rFonts w:ascii="Times New Roman" w:hAnsi="Times New Roman" w:cs="Times New Roman"/>
+          <w:sz w:val="24"/>
+          <w:szCs w:val="24"/>
+          <w:highlight w:val="yellow"/>
+        </w:rPr>
+        <w:t xml:space="preserve"> many</w:t>
+      </w:r>
+      <w:r>
+        <w:rPr>
+          <w:rFonts w:ascii="Times New Roman" w:hAnsi="Times New Roman" w:cs="Times New Roman"/>
+          <w:sz w:val="24"/>
+          <w:szCs w:val="24"/>
+          <w:highlight w:val="yellow"/>
+        </w:rPr>
+        <w:t xml:space="preserve"> other features. We </w:t>
+      </w:r>
+      <w:r>
+        <w:rPr>
+          <w:rFonts w:ascii="Times New Roman" w:hAnsi="Times New Roman" w:cs="Times New Roman"/>
+          <w:sz w:val="24"/>
+          <w:szCs w:val="24"/>
+          <w:highlight w:val="yellow"/>
+        </w:rPr>
+        <w:t>also monitored</w:t>
+      </w:r>
+      <w:r>
+        <w:rPr>
+          <w:rFonts w:ascii="Times New Roman" w:hAnsi="Times New Roman" w:cs="Times New Roman"/>
+          <w:sz w:val="24"/>
+          <w:szCs w:val="24"/>
+          <w:highlight w:val="yellow"/>
+        </w:rPr>
+        <w:t xml:space="preserve"> duplicates, upcoding, and overcharge occurrences</w:t>
+      </w:r>
+      <w:r>
+        <w:rPr>
+          <w:rFonts w:ascii="Times New Roman" w:hAnsi="Times New Roman" w:cs="Times New Roman"/>
+          <w:sz w:val="24"/>
+          <w:szCs w:val="24"/>
+          <w:highlight w:val="yellow"/>
+        </w:rPr>
+        <w:t xml:space="preserve"> to flag </w:t>
+      </w:r>
+      <w:r>
+        <w:rPr>
+          <w:rFonts w:ascii="Times New Roman" w:hAnsi="Times New Roman" w:cs="Times New Roman"/>
+          <w:sz w:val="24"/>
+          <w:szCs w:val="24"/>
+          <w:highlight w:val="yellow"/>
+        </w:rPr>
+        <w:t>suspicious</w:t>
+      </w:r>
+      <w:r>
+        <w:rPr>
+          <w:rFonts w:ascii="Times New Roman" w:hAnsi="Times New Roman" w:cs="Times New Roman"/>
+          <w:sz w:val="24"/>
+          <w:szCs w:val="24"/>
+          <w:highlight w:val="yellow"/>
+        </w:rPr>
+        <w:t xml:space="preserve"> claims</w:t>
+      </w:r>
+      <w:r>
+        <w:rPr>
+          <w:rFonts w:ascii="Times New Roman" w:hAnsi="Times New Roman" w:cs="Times New Roman"/>
+          <w:sz w:val="24"/>
+          <w:szCs w:val="24"/>
+          <w:highlight w:val="yellow"/>
+        </w:rPr>
+        <w:t xml:space="preserve">. </w:t>
+      </w:r>
+      <w:r>
+        <w:rPr>
+          <w:rFonts w:ascii="Times New Roman" w:hAnsi="Times New Roman" w:cs="Times New Roman"/>
+          <w:sz w:val="24"/>
+          <w:szCs w:val="24"/>
+          <w:highlight w:val="yellow"/>
+        </w:rPr>
+        <w:t>We used those</w:t>
+      </w:r>
+      <w:r>
+        <w:rPr>
+          <w:rFonts w:ascii="Times New Roman" w:hAnsi="Times New Roman" w:cs="Times New Roman"/>
+          <w:sz w:val="24"/>
+          <w:szCs w:val="24"/>
+          <w:highlight w:val="yellow"/>
+        </w:rPr>
+        <w:t xml:space="preserve"> inputs for</w:t>
+      </w:r>
+      <w:r>
+        <w:rPr>
+          <w:rFonts w:ascii="Times New Roman" w:hAnsi="Times New Roman" w:cs="Times New Roman"/>
+          <w:sz w:val="24"/>
+          <w:szCs w:val="24"/>
+          <w:highlight w:val="yellow"/>
+        </w:rPr>
+        <w:t xml:space="preserve"> </w:t>
+      </w:r>
+      <w:r>
+        <w:rPr>
+          <w:rFonts w:ascii="Times New Roman" w:hAnsi="Times New Roman" w:cs="Times New Roman"/>
+          <w:sz w:val="24"/>
+          <w:szCs w:val="24"/>
+          <w:highlight w:val="yellow"/>
+        </w:rPr>
+        <w:t>training</w:t>
+      </w:r>
+      <w:r>
+        <w:rPr>
+          <w:rFonts w:ascii="Times New Roman" w:hAnsi="Times New Roman" w:cs="Times New Roman"/>
+          <w:sz w:val="24"/>
+          <w:szCs w:val="24"/>
+          <w:highlight w:val="yellow"/>
+        </w:rPr>
+        <w:t xml:space="preserve"> </w:t>
+      </w:r>
+      <w:r>
+        <w:rPr>
+          <w:rFonts w:ascii="Times New Roman" w:hAnsi="Times New Roman" w:cs="Times New Roman"/>
+          <w:sz w:val="24"/>
+          <w:szCs w:val="24"/>
+          <w:highlight w:val="yellow"/>
+        </w:rPr>
+        <w:t xml:space="preserve">the models </w:t>
+      </w:r>
+      <w:r>
+        <w:rPr>
+          <w:rFonts w:ascii="Times New Roman" w:hAnsi="Times New Roman" w:cs="Times New Roman"/>
+          <w:sz w:val="24"/>
+          <w:szCs w:val="24"/>
+          <w:highlight w:val="yellow"/>
+        </w:rPr>
+        <w:t>i</w:t>
+      </w:r>
+      <w:r>
+        <w:rPr>
+          <w:rFonts w:ascii="Times New Roman" w:hAnsi="Times New Roman" w:cs="Times New Roman"/>
+          <w:sz w:val="24"/>
+          <w:szCs w:val="24"/>
+          <w:highlight w:val="yellow"/>
+        </w:rPr>
+        <w:t xml:space="preserve">n </w:t>
+      </w:r>
+      <w:r>
+        <w:rPr>
+          <w:rFonts w:ascii="Times New Roman" w:hAnsi="Times New Roman" w:cs="Times New Roman"/>
+          <w:sz w:val="24"/>
+          <w:szCs w:val="24"/>
+          <w:highlight w:val="yellow"/>
+        </w:rPr>
+        <w:t>next</w:t>
+      </w:r>
+      <w:r>
+        <w:rPr>
+          <w:rFonts w:ascii="Times New Roman" w:hAnsi="Times New Roman" w:cs="Times New Roman"/>
+          <w:sz w:val="24"/>
+          <w:szCs w:val="24"/>
+          <w:highlight w:val="yellow"/>
+        </w:rPr>
+        <w:t xml:space="preserve"> </w:t>
+      </w:r>
+      <w:r>
+        <w:rPr>
+          <w:rFonts w:ascii="Times New Roman" w:hAnsi="Times New Roman" w:cs="Times New Roman"/>
+          <w:sz w:val="24"/>
+          <w:szCs w:val="24"/>
+          <w:highlight w:val="yellow"/>
+        </w:rPr>
+        <w:t>steps in the end</w:t>
+      </w:r>
+      <w:r>
+        <w:rPr>
+          <w:rFonts w:ascii="Times New Roman" w:hAnsi="Times New Roman" w:cs="Times New Roman"/>
+          <w:sz w:val="24"/>
+          <w:szCs w:val="24"/>
+          <w:highlight w:val="yellow"/>
+        </w:rPr>
+        <w:t>.</w:t>
+      </w:r>
+    </w:p>
+    <w:p>
+      <w:pPr>
+        <w:spacing w:line="360" w:lineRule="auto"/>
+        <w:rPr>
+          <w:rFonts w:ascii="Times New Roman" w:hAnsi="Times New Roman" w:cs="Times New Roman"/>
+          <w:b/>
+          <w:bCs/>
+          <w:i/>
+          <w:iCs/>
+          <w:sz w:val="24"/>
+          <w:szCs w:val="24"/>
+        </w:rPr>
+      </w:pPr>
+      <w:r>
+        <w:rPr>
+          <w:rFonts w:ascii="Times New Roman" w:hAnsi="Times New Roman" w:cs="Times New Roman"/>
+          <w:b/>
+          <w:bCs/>
+          <w:i/>
+          <w:iCs/>
+          <w:sz w:val="24"/>
+          <w:szCs w:val="24"/>
+        </w:rPr>
+        <w:t>3.4 Exploratory analysis and feature selection</w:t>
+      </w:r>
+    </w:p>
+    <w:p>
+      <w:pPr>
+        <w:spacing w:after="240" w:line="360" w:lineRule="auto"/>
+        <w:rPr>
+          <w:rFonts w:ascii="Times New Roman" w:hAnsi="Times New Roman" w:cs="Times New Roman"/>
+          <w:sz w:val="24"/>
+          <w:szCs w:val="24"/>
+        </w:rPr>
+      </w:pPr>
+      <w:r>
+        <w:rPr>
+          <w:rFonts w:ascii="Times New Roman" w:hAnsi="Times New Roman" w:cs="Times New Roman"/>
+          <w:sz w:val="24"/>
+          <w:szCs w:val="24"/>
+          <w:highlight w:val="yellow"/>
+        </w:rPr>
+        <w:t>After building the SQL feature store, we performed exploratory analysis and feature selection in Python, using SQLAlchemy and pandas to load the claim- and provider-level feature tables and inspect basic distributions. For key continuous variables such as reimbursed amounts, deductibles, and inpatient length of stay, we plotted histograms and boxplots to assess skewness, long tails, and potential data errors, confirming the expected heavy-tailed patterns. We quantified outliers with robust statistics by computing interquartile ranges and robust z-scores based on the median and median absolute deviation, flagging extreme claims and comparing these to rule-based indicators such as overcharge flags and short-stay high-payment inpatient claims. At the provider level, we examined correlations among engineered features using pairwise correlation coefficients and variance inflation factors to identify and remove highly collinear variables, particularly overlapping measures of recent reimbursement and claim volumes. Based on these diagnostics, we retained a compact, interpretable set of provider features—covering total and recent reimbursement, recent claim and unique beneficiary counts, code diversity, peer-normalized reimbursement and length-of-stay z-scores, and aggregated counts of duplicate, upcoding, and overcharge events—for all subsequent supervised learning and clustering analyses.</w:t>
+      </w:r>
+    </w:p>
+    <w:p>
+      <w:pPr>
+        <w:spacing w:line="360" w:lineRule="auto"/>
+        <w:rPr>
+          <w:rFonts w:ascii="Times New Roman" w:hAnsi="Times New Roman" w:cs="Times New Roman"/>
+          <w:b/>
+          <w:bCs/>
+          <w:i/>
+          <w:iCs/>
+          <w:sz w:val="24"/>
+          <w:szCs w:val="24"/>
+        </w:rPr>
+      </w:pPr>
+      <w:r>
+        <w:rPr>
+          <w:rFonts w:ascii="Times New Roman" w:hAnsi="Times New Roman" w:cs="Times New Roman"/>
+          <w:b/>
+          <w:bCs/>
+          <w:i/>
+          <w:iCs/>
+          <w:sz w:val="24"/>
+          <w:szCs w:val="24"/>
+        </w:rPr>
+        <w:t>3.5 Unsupervised fraud-only claim clustering</w:t>
+      </w:r>
+    </w:p>
+    <w:p>
+      <w:pPr>
+        <w:spacing w:after="240" w:line="360" w:lineRule="auto"/>
+        <w:rPr>
+          <w:rFonts w:ascii="Times New Roman" w:hAnsi="Times New Roman" w:cs="Times New Roman"/>
+          <w:sz w:val="24"/>
+          <w:szCs w:val="24"/>
+        </w:rPr>
+      </w:pPr>
+      <w:r>
+        <w:rPr>
+          <w:rFonts w:ascii="Times New Roman" w:hAnsi="Times New Roman" w:cs="Times New Roman"/>
+          <w:sz w:val="24"/>
+          <w:szCs w:val="24"/>
+        </w:rPr>
+        <w:t xml:space="preserve">To better understand heterogeneity in fraudulent behavior, we clustered fraud-only claims. We first identified fraudulent providers from the training labels and extracted all associated inpatient </w:t>
+      </w:r>
+      <w:r>
+        <w:rPr>
+          <w:rFonts w:ascii="Times New Roman" w:hAnsi="Times New Roman" w:cs="Times New Roman"/>
+          <w:sz w:val="24"/>
+          <w:szCs w:val="24"/>
+        </w:rPr>
+        <w:lastRenderedPageBreak/>
+        <w:t>and outpatient claims, building separate fraud-only tables. Using standardized engineered features—reimbursed amount, diagnosis and procedure counts, claim-level rule flags (duplicate and overcharge), and peer-normalized z-scores—we imputed missing values, scaled features, and applied HDBSCAN separately to inpatient and outpatient claims, choosing it for its ability to find clusters of varying size and density while treating atypical claims as noise. We tuned minimum cluster size and minimum samples, evaluated clustering quality with internal metrics and the noise fraction, and visualized structure via PCA projections colored by HDBSCAN cluster assignments. For each cluster, we produced “cluster cards” summarizing size, reimbursement levels, diagnosis/procedure multiplicity, and frequencies of rule flags, and we ran association rule mining within clusters to find frequent, high-lift diagnosis–procedure combinations, using these summaries and patterns to characterize distinct types of fraudulent claim behavior.</w:t>
+      </w:r>
+    </w:p>
+    <w:p>
+      <w:pPr>
+        <w:spacing w:line="360" w:lineRule="auto"/>
+        <w:rPr>
+          <w:rFonts w:ascii="Times New Roman" w:hAnsi="Times New Roman" w:cs="Times New Roman"/>
+          <w:b/>
+          <w:bCs/>
+          <w:i/>
+          <w:iCs/>
+          <w:sz w:val="24"/>
+          <w:szCs w:val="24"/>
+        </w:rPr>
+      </w:pPr>
+      <w:r>
+        <w:rPr>
+          <w:rFonts w:ascii="Times New Roman" w:hAnsi="Times New Roman" w:cs="Times New Roman"/>
+          <w:b/>
+          <w:bCs/>
+          <w:i/>
+          <w:iCs/>
+          <w:sz w:val="24"/>
+          <w:szCs w:val="24"/>
+        </w:rPr>
+        <w:t>3.6 Supervised provider fraud classification</w:t>
+      </w:r>
+    </w:p>
+    <w:p>
+      <w:pPr>
+        <w:spacing w:after="240" w:line="360" w:lineRule="auto"/>
+        <w:rPr>
+          <w:rFonts w:ascii="Times New Roman" w:hAnsi="Times New Roman" w:cs="Times New Roman"/>
+          <w:sz w:val="24"/>
+          <w:szCs w:val="24"/>
+        </w:rPr>
+      </w:pPr>
+      <w:r>
+        <w:rPr>
+          <w:rFonts w:ascii="Times New Roman" w:hAnsi="Times New Roman" w:cs="Times New Roman"/>
+          <w:sz w:val="24"/>
+          <w:szCs w:val="24"/>
+        </w:rPr>
+        <w:t>We used supervised learning to predict whether a provider is fraudulent based on aggregated claims features. Modelling was restricted to labeled training providers, with a stratified 70/30 provider-level split that preserved the fraud/non-fraud ratio. All provider-level features from the feature store were merged with the binary fraud label, and continuous variables were standardized using statistics from the training subset, then applied unchanged to the hold-out set. We compared multiple classifiers on the same feature set—logistic regression with elastic-net regularization, Random Forests, Extremely Randomized Trees, LightGBM, XGBoost, and CatBoost—using class weighting or imbalance-aware parameters to address the rarity of fraudulent providers. Hyperparameters were tuned via randomized search with five-fold cross-validation, optimizing area under the precision–recall curve (PR-AUC), and final models were evaluated on the 30% hold-out set using accuracy, precision, recall, F1, PR-AUC, and ROC-AUC. Instead of fixing a 0.5 cutoff, we chose the probability threshold that maximized F1 on the hold-out precision–recall curve. Logistic regression with elastic-net and class-balanced weighting emerged as the primary model, offering strong PR-AUC, competitive F1, and interpretable coefficients, while tree-based models served as baselines that confirmed most performance gains came from the engineered features rather than model complexity.</w:t>
+      </w:r>
+    </w:p>
+    <w:p>
+      <w:pPr>
+        <w:spacing w:line="360" w:lineRule="auto"/>
+        <w:rPr>
+          <w:rFonts w:ascii="Times New Roman" w:hAnsi="Times New Roman" w:cs="Times New Roman"/>
+          <w:b/>
+          <w:bCs/>
+          <w:i/>
+          <w:iCs/>
+          <w:sz w:val="24"/>
+          <w:szCs w:val="24"/>
+        </w:rPr>
+      </w:pPr>
+      <w:r>
+        <w:rPr>
+          <w:rFonts w:ascii="Times New Roman" w:hAnsi="Times New Roman" w:cs="Times New Roman"/>
+          <w:b/>
+          <w:bCs/>
+          <w:i/>
+          <w:iCs/>
+          <w:sz w:val="24"/>
+          <w:szCs w:val="24"/>
+        </w:rPr>
+        <w:t>3.7 Provider fraud-type clustering</w:t>
+      </w:r>
+    </w:p>
+    <w:p>
+      <w:pPr>
+        <w:spacing w:after="100" w:afterAutospacing="1" w:line="360" w:lineRule="auto"/>
+        <w:rPr>
+          <w:rFonts w:ascii="Times New Roman" w:hAnsi="Times New Roman" w:cs="Times New Roman"/>
+          <w:sz w:val="24"/>
+          <w:szCs w:val="24"/>
+        </w:rPr>
+      </w:pPr>
+      <w:r>
+        <w:rPr>
+          <w:rFonts w:ascii="Times New Roman" w:hAnsi="Times New Roman" w:cs="Times New Roman"/>
+          <w:sz w:val="24"/>
+          <w:szCs w:val="24"/>
+        </w:rPr>
+        <w:lastRenderedPageBreak/>
+        <w:t>Beyond predicting whether a provider is fraudulent, we also sought to characterize distinct fraud patterns among high-risk providers. We defined a high-risk universe by combining all labeled fraudulent training providers with test providers whose logistic regression fraud scores exceeded a high threshold, then extracted the same standardized provider features used in supervised modeling (reimbursement levels, multi-window claims volumes, unique beneficiary counts, peer-normalized inpatient and outpatient z-scores, and rule counts for duplicates, upcoding, and overcharging). We applied HDBSCAN with Euclidean distance, a minimum cluster size of 10, and a small minimum samples value, allowing clusters of varying size and density and labeling atypical providers as noise. To examine structure, we projected providers into two principal components and colored points by cluster label, with noise in grey. For each cluster, we produced “cluster cards” summarizing size, labeled vs high-scored mix, and median utilization, payment, and rule-based features, interpreting them as fraud-type archetypes (e.g., high-revenue inpatient overchargers, high-volume outpatient overbillers).</w:t>
+      </w:r>
+    </w:p>
+    <w:p>
+      <w:pPr>
+        <w:pStyle w:val="Heading1"/>
+        <w:spacing w:before="0" w:after="240"/>
+        <w:rPr>
+          <w:rFonts w:ascii="Times New Roman" w:hAnsi="Times New Roman" w:cs="Times New Roman"/>
+          <w:b/>
+          <w:bCs/>
+          <w:sz w:val="28"/>
+          <w:szCs w:val="28"/>
+        </w:rPr>
+      </w:pPr>
+      <w:r>
+        <w:rPr>
+          <w:rFonts w:ascii="Times New Roman" w:hAnsi="Times New Roman" w:cs="Times New Roman"/>
+          <w:b/>
+          <w:bCs/>
+          <w:sz w:val="28"/>
+          <w:szCs w:val="28"/>
+        </w:rPr>
         <w:t>4. Results</w:t>
       </w:r>
     </w:p>
@@ -1206,7 +3280,7 @@
         </w:rPr>
         <w:lastRenderedPageBreak/>
         <w:drawing>
-          <wp:inline distT="0" distB="0" distL="0" distR="0" wp14:anchorId="7DB9F5ED" wp14:editId="756D367E">
+          <wp:inline distT="0" distB="0" distL="0" distR="0" wp14:anchorId="7DB9F5ED" wp14:editId="2F3C7956">
             <wp:extent cx="2582883" cy="1930814"/>
             <wp:effectExtent l="0" t="0" r="8255" b="0"/>
             <wp:docPr id="1172243241" name="Picture 1" descr="A collage of graphs&#10;&#10;AI-generated content may be incorrect."/>
@@ -1676,7 +3750,7 @@
           <w:lang w:val="en-US"/>
         </w:rPr>
         <w:drawing>
-          <wp:inline distT="0" distB="0" distL="0" distR="0" wp14:anchorId="6D2A79C3" wp14:editId="160C6AE3">
+          <wp:inline distT="0" distB="0" distL="0" distR="0" wp14:anchorId="6D2A79C3" wp14:editId="7E23673D">
             <wp:extent cx="2794883" cy="1783231"/>
             <wp:effectExtent l="0" t="0" r="5715" b="7620"/>
             <wp:docPr id="339040142" name="Picture 5" descr="A graph showing a graph showing a number of points&#10;&#10;AI-generated content may be incorrect."/>
@@ -3271,7 +5345,87 @@
           <w:sz w:val="24"/>
           <w:szCs w:val="24"/>
         </w:rPr>
-        <w:t xml:space="preserve">We evaluated supervised models for predicting provider fraud status using provider-level features. On the 30% hold-out subset of labeled providers, all models achieved ROC-AUC (≈0.93–0.94), indicating good discrimination; performance metrics are reported in Table 2. Logistic regression with elastic-net regularization and class-balanced weighting performed best, with PR-AUC ≈0.71, ROC-AUC ≈0.93, and, after threshold tuning, precision ≈0.74, recall ≈0.56, and F1 ≈0.65. Tree-based models (Random Forests, gradient boosting methods, CatBoost) achieved similar ROC-AUC but weaker PR-AUC or precision–recall trade-offs and did not surpass the interpretable linear model. Logistic regression fraud risk scores (Figure </w:t>
+        <w:t>We evaluated supervised models for predicting provider fraud status using provider-level features. On the 30% hold-out subset of labeled providers, all models achieved ROC-AUC (≈0.93–0.94), indicating good discrimination; performance metrics are reported in Table 2. Logistic regression with elastic-net regularization and class-balanced weighting performed best, with PR-AUC ≈0.7</w:t>
+      </w:r>
+      <w:r>
+        <w:rPr>
+          <w:rFonts w:ascii="Times New Roman" w:eastAsia="Times New Roman" w:hAnsi="Times New Roman" w:cs="Times New Roman"/>
+          <w:sz w:val="24"/>
+          <w:szCs w:val="24"/>
+        </w:rPr>
+        <w:t>3</w:t>
+      </w:r>
+      <w:r>
+        <w:rPr>
+          <w:rFonts w:ascii="Times New Roman" w:eastAsia="Times New Roman" w:hAnsi="Times New Roman" w:cs="Times New Roman"/>
+          <w:sz w:val="24"/>
+          <w:szCs w:val="24"/>
+        </w:rPr>
+        <w:t>, ROC-AUC ≈0.9</w:t>
+      </w:r>
+      <w:r>
+        <w:rPr>
+          <w:rFonts w:ascii="Times New Roman" w:eastAsia="Times New Roman" w:hAnsi="Times New Roman" w:cs="Times New Roman"/>
+          <w:sz w:val="24"/>
+          <w:szCs w:val="24"/>
+        </w:rPr>
+        <w:t>4</w:t>
+      </w:r>
+      <w:r>
+        <w:rPr>
+          <w:rFonts w:ascii="Times New Roman" w:eastAsia="Times New Roman" w:hAnsi="Times New Roman" w:cs="Times New Roman"/>
+          <w:sz w:val="24"/>
+          <w:szCs w:val="24"/>
+        </w:rPr>
+        <w:t>, and, after threshold tuning, precision ≈0.</w:t>
+      </w:r>
+      <w:r>
+        <w:rPr>
+          <w:rFonts w:ascii="Times New Roman" w:eastAsia="Times New Roman" w:hAnsi="Times New Roman" w:cs="Times New Roman"/>
+          <w:sz w:val="24"/>
+          <w:szCs w:val="24"/>
+        </w:rPr>
+        <w:t>59</w:t>
+      </w:r>
+      <w:r>
+        <w:rPr>
+          <w:rFonts w:ascii="Times New Roman" w:eastAsia="Times New Roman" w:hAnsi="Times New Roman" w:cs="Times New Roman"/>
+          <w:sz w:val="24"/>
+          <w:szCs w:val="24"/>
+        </w:rPr>
+        <w:t>, recall ≈0.</w:t>
+      </w:r>
+      <w:r>
+        <w:rPr>
+          <w:rFonts w:ascii="Times New Roman" w:eastAsia="Times New Roman" w:hAnsi="Times New Roman" w:cs="Times New Roman"/>
+          <w:sz w:val="24"/>
+          <w:szCs w:val="24"/>
+        </w:rPr>
+        <w:t>74</w:t>
+      </w:r>
+      <w:r>
+        <w:rPr>
+          <w:rFonts w:ascii="Times New Roman" w:eastAsia="Times New Roman" w:hAnsi="Times New Roman" w:cs="Times New Roman"/>
+          <w:sz w:val="24"/>
+          <w:szCs w:val="24"/>
+        </w:rPr>
+        <w:t>, and F1 ≈0.6</w:t>
+      </w:r>
+      <w:r>
+        <w:rPr>
+          <w:rFonts w:ascii="Times New Roman" w:eastAsia="Times New Roman" w:hAnsi="Times New Roman" w:cs="Times New Roman"/>
+          <w:sz w:val="24"/>
+          <w:szCs w:val="24"/>
+        </w:rPr>
+        <w:t>6</w:t>
+      </w:r>
+      <w:r>
+        <w:rPr>
+          <w:rFonts w:ascii="Times New Roman" w:eastAsia="Times New Roman" w:hAnsi="Times New Roman" w:cs="Times New Roman"/>
+          <w:sz w:val="24"/>
+          <w:szCs w:val="24"/>
+        </w:rPr>
+        <w:t xml:space="preserve">. Tree-based models (Random Forests, gradient boosting methods, CatBoost) achieved similar ROC-AUC but weaker PR-AUC or precision–recall trade-offs and did not surpass the interpretable linear model. Logistic regression fraud risk scores (Figure </w:t>
       </w:r>
       <w:r>
         <w:rPr>
@@ -4261,7 +6415,7 @@
           <w:szCs w:val="24"/>
           <w:lang w:val="en-US"/>
         </w:rPr>
-        <w:t>, LightGBM, XGBoost, CatBoost, and a multilayer perceptron, reported as accuracy, precision, recall, F1-score, area under the precision–recall curve (PR-AUC), and area under the ROC curve (ROC-AUC).</w:t>
+        <w:t>, LightGBM, XGBoost, CatBoost reported as accuracy, precision, recall, F1-score, area under the precision–recall curve (PR-AUC), and area under the ROC curve (ROC-AUC).</w:t>
       </w:r>
     </w:p>
     <w:p>
@@ -5755,15 +7909,7 @@
           <w:sz w:val="24"/>
           <w:szCs w:val="24"/>
         </w:rPr>
-        <w:t>,</w:t>
-      </w:r>
-      <w:r>
-        <w:rPr>
-          <w:rFonts w:ascii="Times New Roman" w:hAnsi="Times New Roman" w:cs="Times New Roman"/>
-          <w:sz w:val="24"/>
-          <w:szCs w:val="24"/>
-        </w:rPr>
-        <w:t xml:space="preserve"> validation, </w:t>
+        <w:t xml:space="preserve">, validation, </w:t>
       </w:r>
       <w:r>
         <w:rPr>
@@ -7421,6 +9567,7 @@
   <w:style w:type="character" w:default="1" w:styleId="DefaultParagraphFont">
     <w:name w:val="Default Paragraph Font"/>
     <w:uiPriority w:val="1"/>
+    <w:semiHidden/>
     <w:unhideWhenUsed/>
   </w:style>
   <w:style w:type="table" w:default="1" w:styleId="TableNormal">

</xml_diff>